<commit_message>
docs(release-evidence): finalize COVERAGE_MATRIX + REVIEW_PACKAGE for candidate 45cc661
Update both review documents from the stale b317833 candidate to the current
HEAD 45cc661, covering the new work on this branch:
- recovery window = real remaining fetch-phase budget (B1-7; gap #3 resolved)
- bounded in-flight browser interrupt on fetchPdfViaBrowser path (real Chromium)
- obsolete-work settlement for coalesced callers (B7-3)
- proc-admission withdrawal across real fork+IPC (isolated-proc-admission)
- explicit unattempted-URL terminal outcomes on cancel (real Postgres)

11 test files all green (33 node:test subtests + 60 scoring-unit, 0 failures).
tsc normalized: candidate 12 / base 13 unique signatures, 0 new errors.
All 10 mutation demos applied/observed/reverted clean this session.
Honest gaps kept: fetchWithBrowser HTML path still not wired to the bounded
interrupt; specific production stalls unobserved.

Feature branch only; origin/main untouched at 8c03b07; no deploy/paid runs.
</commit_message>
<xml_diff>
--- a/deliverables/release-evidence/REVIEW_PACKAGE.docx
+++ b/deliverables/release-evidence/REVIEW_PACKAGE.docx
@@ -26,7 +26,23 @@
         <w:t xml:space="preserve"> </w:t>
       </w:r>
       <w:r>
-        <w:t xml:space="preserve">This packet supersedes the earlier</w:t>
+        <w:t xml:space="preserve">This packet reviews the</w:t>
+      </w:r>
+      <w:r>
+        <w:t xml:space="preserve"> </w:t>
+      </w:r>
+      <w:r>
+        <w:rPr>
+          <w:bCs/>
+          <w:b/>
+        </w:rPr>
+        <w:t xml:space="preserve">operation-scoped-cancellation</w:t>
+      </w:r>
+      <w:r>
+        <w:t xml:space="preserve"> </w:t>
+      </w:r>
+      <w:r>
+        <w:t xml:space="preserve">work. It supersedes the earlier</w:t>
       </w:r>
       <w:r>
         <w:t xml:space="preserve"> </w:t>
@@ -44,23 +60,7 @@
         <w:t xml:space="preserve"> </w:t>
       </w:r>
       <w:r>
-        <w:t xml:space="preserve">packet for the purpose of reviewing the</w:t>
-      </w:r>
-      <w:r>
-        <w:t xml:space="preserve"> </w:t>
-      </w:r>
-      <w:r>
-        <w:rPr>
-          <w:bCs/>
-          <w:b/>
-        </w:rPr>
-        <w:t xml:space="preserve">operation-scoped-cancellation</w:t>
-      </w:r>
-      <w:r>
-        <w:t xml:space="preserve"> </w:t>
-      </w:r>
-      <w:r>
-        <w:t xml:space="preserve">work. That earlier release (candidate</w:t>
+        <w:t xml:space="preserve">packet (candidate</w:t>
       </w:r>
       <w:r>
         <w:t xml:space="preserve"> </w:t>
@@ -84,7 +84,7 @@
         <w:t xml:space="preserve">b676c2d</w:t>
       </w:r>
       <w:r>
-        <w:t xml:space="preserve">) is a separate change; its packet is preserved in git history and in the prior patch artifacts. Nothing here touches BM25/aboutness/discovery/counters/scoring/operating-settings,</w:t>
+        <w:t xml:space="preserve">), which is a separate change preserved in git history. Nothing here touches BM25/aboutness/discovery/counters/scoring/operating-settings,</w:t>
       </w:r>
       <w:r>
         <w:t xml:space="preserve"> </w:t>
@@ -100,6 +100,16 @@
       </w:r>
       <w:r>
         <w:t xml:space="preserve">stays unset, and there is no quarantine-recovery override.</w:t>
+      </w:r>
+      <w:r>
+        <w:t xml:space="preserve"> </w:t>
+      </w:r>
+      <w:r>
+        <w:rPr>
+          <w:bCs/>
+          <w:b/>
+        </w:rPr>
+        <w:t xml:space="preserve">This is a local feature-branch review candidate only: no merge, no deploy, no paid/Railway runs, no live web/LLM calls.</w:t>
       </w:r>
     </w:p>
     <w:tbl>
@@ -139,12 +149,6 @@
               </w:rPr>
               <w:t xml:space="preserve">fix/operation-scoped-cancellation</w:t>
             </w:r>
-            <w:r>
-              <w:t xml:space="preserve"> </w:t>
-            </w:r>
-            <w:r>
-              <w:t xml:space="preserve">(pushed to origin)</w:t>
-            </w:r>
           </w:p>
         </w:tc>
       </w:tr>
@@ -240,7 +244,7 @@
                 <w:bCs/>
                 <w:b/>
               </w:rPr>
-              <w:t xml:space="preserve">b317833e876332b528759cf9b3ff546d1b20ba39</w:t>
+              <w:t xml:space="preserve">45cc661d2898e52ad8512083929535d1667050d7</w:t>
             </w:r>
           </w:p>
         </w:tc>
@@ -276,6 +280,66 @@
             </w:r>
             <w:r>
               <w:t xml:space="preserve">(B1 recovery scope + B6 killable pdf-parse subprocess) →</w:t>
+            </w:r>
+            <w:r>
+              <w:t xml:space="preserve"> </w:t>
+            </w:r>
+            <w:r>
+              <w:rPr>
+                <w:rStyle w:val="VerbatimChar"/>
+              </w:rPr>
+              <w:t xml:space="preserve">b317833</w:t>
+            </w:r>
+            <w:r>
+              <w:t xml:space="preserve"> </w:t>
+            </w:r>
+            <w:r>
+              <w:t xml:space="preserve">(B2/B3/B7 production-boundary tests + B7 test seam) →</w:t>
+            </w:r>
+            <w:r>
+              <w:t xml:space="preserve"> </w:t>
+            </w:r>
+            <w:r>
+              <w:rPr>
+                <w:rStyle w:val="VerbatimChar"/>
+              </w:rPr>
+              <w:t xml:space="preserve">0d05556</w:t>
+            </w:r>
+            <w:r>
+              <w:t xml:space="preserve"> </w:t>
+            </w:r>
+            <w:r>
+              <w:t xml:space="preserve">(recovery window = real remaining fetch-phase budget) →</w:t>
+            </w:r>
+            <w:r>
+              <w:t xml:space="preserve"> </w:t>
+            </w:r>
+            <w:r>
+              <w:rPr>
+                <w:rStyle w:val="VerbatimChar"/>
+              </w:rPr>
+              <w:t xml:space="preserve">782f99d</w:t>
+            </w:r>
+            <w:r>
+              <w:t xml:space="preserve"> </w:t>
+            </w:r>
+            <w:r>
+              <w:t xml:space="preserve">(bounded in-flight browser interruption) →</w:t>
+            </w:r>
+            <w:r>
+              <w:t xml:space="preserve"> </w:t>
+            </w:r>
+            <w:r>
+              <w:rPr>
+                <w:rStyle w:val="VerbatimChar"/>
+              </w:rPr>
+              <w:t xml:space="preserve">e4894ae</w:t>
+            </w:r>
+            <w:r>
+              <w:t xml:space="preserve"> </w:t>
+            </w:r>
+            <w:r>
+              <w:t xml:space="preserve">(obsolete-work settlement for coalesced callers) →</w:t>
             </w:r>
             <w:r>
               <w:t xml:space="preserve"> </w:t>
@@ -286,90 +350,13 @@
                 <w:bCs/>
                 <w:b/>
               </w:rPr>
-              <w:t xml:space="preserve">b317833</w:t>
-            </w:r>
-            <w:r>
-              <w:t xml:space="preserve"> </w:t>
-            </w:r>
-            <w:r>
-              <w:t xml:space="preserve">(B2/B3/B7 production-boundary tests + a 20-line B7 test seam in</w:t>
-            </w:r>
-            <w:r>
-              <w:t xml:space="preserve"> </w:t>
-            </w:r>
-            <w:r>
-              <w:rPr>
-                <w:rStyle w:val="VerbatimChar"/>
-              </w:rPr>
-              <w:t xml:space="preserve">processor.ts</w:t>
-            </w:r>
-            <w:r>
-              <w:t xml:space="preserve">)</w:t>
-            </w:r>
-          </w:p>
-        </w:tc>
-      </w:tr>
-      <w:tr>
-        <w:tc>
-          <w:tcPr/>
-          <w:p>
-            <w:pPr>
-              <w:pStyle w:val="Compact"/>
-              <w:jc w:val="left"/>
-            </w:pPr>
-            <w:r>
-              <w:t xml:space="preserve">Candidate vs base</w:t>
-            </w:r>
-          </w:p>
-        </w:tc>
-        <w:tc>
-          <w:tcPr/>
-          <w:p>
-            <w:pPr>
-              <w:pStyle w:val="Compact"/>
-              <w:jc w:val="left"/>
-            </w:pPr>
-            <w:r>
-              <w:rPr>
-                <w:rStyle w:val="VerbatimChar"/>
-              </w:rPr>
-              <w:t xml:space="preserve">git diff --stat origin/main..b317833</w:t>
-            </w:r>
-            <w:r>
-              <w:t xml:space="preserve"> </w:t>
-            </w:r>
-            <w:r>
-              <w:t xml:space="preserve">— code changes concentrated in</w:t>
-            </w:r>
-            <w:r>
-              <w:t xml:space="preserve"> </w:t>
-            </w:r>
-            <w:r>
-              <w:rPr>
-                <w:rStyle w:val="VerbatimChar"/>
-              </w:rPr>
-              <w:t xml:space="preserve">server/lib/processor.ts</w:t>
-            </w:r>
-            <w:r>
-              <w:t xml:space="preserve"> </w:t>
-            </w:r>
-            <w:r>
-              <w:t xml:space="preserve">(+623/−132 region) and</w:t>
-            </w:r>
-            <w:r>
-              <w:t xml:space="preserve"> </w:t>
-            </w:r>
-            <w:r>
-              <w:rPr>
-                <w:rStyle w:val="VerbatimChar"/>
-              </w:rPr>
-              <w:t xml:space="preserve">server/lib/pipeline.ts</w:t>
-            </w:r>
-            <w:r>
-              <w:t xml:space="preserve"> </w:t>
-            </w:r>
-            <w:r>
-              <w:t xml:space="preserve">(+253/−… region), plus 6 new test files and supporting fixtures/evidence. Full list in §1.</w:t>
+              <w:t xml:space="preserve">45cc661</w:t>
+            </w:r>
+            <w:r>
+              <w:t xml:space="preserve"> </w:t>
+            </w:r>
+            <w:r>
+              <w:t xml:space="preserve">(real-IPC proc-admission withdrawal test + explicit unattempted-URL outcomes)</w:t>
             </w:r>
           </w:p>
         </w:tc>
@@ -487,7 +474,7 @@
         </w:pict>
       </w:r>
     </w:p>
-    <w:bookmarkStart w:id="20" w:name="what-changed-originmain..b317833"/>
+    <w:bookmarkStart w:id="20" w:name="what-changed-originmain..45cc661"/>
     <w:p>
       <w:pPr>
         <w:pStyle w:val="Heading2"/>
@@ -499,7 +486,7 @@
         <w:rPr>
           <w:rStyle w:val="VerbatimChar"/>
         </w:rPr>
-        <w:t xml:space="preserve">origin/main..b317833</w:t>
+        <w:t xml:space="preserve">origin/main..45cc661</w:t>
       </w:r>
       <w:r>
         <w:t xml:space="preserve">)</w:t>
@@ -535,9 +522,15 @@
       <w:r>
         <w:t xml:space="preserve">—</w:t>
       </w:r>
-      <w:r>
-        <w:t xml:space="preserve"> </w:t>
-      </w:r>
+    </w:p>
+    <w:p>
+      <w:pPr>
+        <w:numPr>
+          <w:ilvl w:val="1"/>
+          <w:numId w:val="1002"/>
+        </w:numPr>
+        <w:pStyle w:val="Compact"/>
+      </w:pPr>
       <w:r>
         <w:rPr>
           <w:rStyle w:val="VerbatimChar"/>
@@ -548,7 +541,7 @@
         <w:t xml:space="preserve"> </w:t>
       </w:r>
       <w:r>
-        <w:t xml:space="preserve">helper (def line 275): arms</w:t>
+        <w:t xml:space="preserve">arms</w:t>
       </w:r>
       <w:r>
         <w:t xml:space="preserve"> </w:t>
@@ -573,7 +566,7 @@
         <w:t xml:space="preserve"> </w:t>
       </w:r>
       <w:r>
-        <w:t xml:space="preserve">for a company’s PDF recovery, caps its deadline by</w:t>
+        <w:t xml:space="preserve">per company PDF recovery, caps its deadline by</w:t>
       </w:r>
       <w:r>
         <w:t xml:space="preserve"> </w:t>
@@ -610,34 +603,178 @@
         <w:t xml:space="preserve">fetchFn(origin, slice, { outcomes, scope })</w:t>
       </w:r>
       <w:r>
-        <w:t xml:space="preserve">, line 314), stops dispatching once the scope aborts (leaving the untried tail retryable), and caps total attempts across origins. Called in production at line 1714 with the real</w:t>
-      </w:r>
-      <w:r>
-        <w:t xml:space="preserve"> </w:t>
-      </w:r>
-      <w:r>
-        <w:rPr>
-          <w:rStyle w:val="VerbatimChar"/>
-        </w:rPr>
-        <w:t xml:space="preserve">fetchIssuerPdfsWithPrimedSession</w:t>
-      </w:r>
-      <w:r>
-        <w:t xml:space="preserve"> </w:t>
-      </w:r>
-      <w:r>
-        <w:t xml:space="preserve">as default</w:t>
-      </w:r>
-      <w:r>
-        <w:t xml:space="preserve"> </w:t>
-      </w:r>
-      <w:r>
-        <w:rPr>
-          <w:rStyle w:val="VerbatimChar"/>
-        </w:rPr>
-        <w:t xml:space="preserve">fetchFn</w:t>
-      </w:r>
-      <w:r>
-        <w:t xml:space="preserve">.</w:t>
+        <w:t xml:space="preserve">), stops dispatching once the scope aborts (leaving the untried tail retryable), and caps total attempts across origins.</w:t>
+      </w:r>
+    </w:p>
+    <w:p>
+      <w:pPr>
+        <w:numPr>
+          <w:ilvl w:val="1"/>
+          <w:numId w:val="1002"/>
+        </w:numPr>
+        <w:pStyle w:val="Compact"/>
+      </w:pPr>
+      <w:r>
+        <w:rPr>
+          <w:bCs/>
+          <w:b/>
+        </w:rPr>
+        <w:t xml:space="preserve">(</w:t>
+      </w:r>
+      <w:r>
+        <w:rPr>
+          <w:rStyle w:val="VerbatimChar"/>
+          <w:bCs/>
+          <w:b/>
+        </w:rPr>
+        <w:t xml:space="preserve">0d05556</w:t>
+      </w:r>
+      <w:r>
+        <w:rPr>
+          <w:bCs/>
+          <w:b/>
+        </w:rPr>
+        <w:t xml:space="preserve">)</w:t>
+      </w:r>
+      <w:r>
+        <w:t xml:space="preserve"> </w:t>
+      </w:r>
+      <w:r>
+        <w:rPr>
+          <w:rStyle w:val="VerbatimChar"/>
+        </w:rPr>
+        <w:t xml:space="preserve">remainingFetchBudgetMs(fetchPhaseStart)</w:t>
+      </w:r>
+      <w:r>
+        <w:t xml:space="preserve"> </w:t>
+      </w:r>
+      <w:r>
+        <w:t xml:space="preserve">returns the real remaining fetch-phase budget (configured budget minus elapsed, clamped to</w:t>
+      </w:r>
+      <w:r>
+        <w:t xml:space="preserve"> </w:t>
+      </w:r>
+      <w:r>
+        <w:rPr>
+          <w:rStyle w:val="VerbatimChar"/>
+        </w:rPr>
+        <w:t xml:space="preserve">RECOVERY_WINDOW_FLOOR_MS</w:t>
+      </w:r>
+      <w:r>
+        <w:t xml:space="preserve">), and the recovery call site now feeds</w:t>
+      </w:r>
+      <w:r>
+        <w:t xml:space="preserve"> </w:t>
+      </w:r>
+      <w:r>
+        <w:rPr>
+          <w:bCs/>
+          <w:b/>
+        </w:rPr>
+        <w:t xml:space="preserve">that</w:t>
+      </w:r>
+      <w:r>
+        <w:t xml:space="preserve"> </w:t>
+      </w:r>
+      <w:r>
+        <w:t xml:space="preserve">as</w:t>
+      </w:r>
+      <w:r>
+        <w:t xml:space="preserve"> </w:t>
+      </w:r>
+      <w:r>
+        <w:rPr>
+          <w:rStyle w:val="VerbatimChar"/>
+        </w:rPr>
+        <w:t xml:space="preserve">remainingMs</w:t>
+      </w:r>
+      <w:r>
+        <w:t xml:space="preserve"> </w:t>
+      </w:r>
+      <w:r>
+        <w:t xml:space="preserve">— so the production recovery window is the per-company remaining budget, not the raw 600000 ms constant. The constant itself is unchanged.</w:t>
+      </w:r>
+    </w:p>
+    <w:p>
+      <w:pPr>
+        <w:numPr>
+          <w:ilvl w:val="1"/>
+          <w:numId w:val="1002"/>
+        </w:numPr>
+        <w:pStyle w:val="Compact"/>
+      </w:pPr>
+      <w:r>
+        <w:rPr>
+          <w:bCs/>
+          <w:b/>
+        </w:rPr>
+        <w:t xml:space="preserve">(</w:t>
+      </w:r>
+      <w:r>
+        <w:rPr>
+          <w:rStyle w:val="VerbatimChar"/>
+          <w:bCs/>
+          <w:b/>
+        </w:rPr>
+        <w:t xml:space="preserve">45cc661</w:t>
+      </w:r>
+      <w:r>
+        <w:rPr>
+          <w:bCs/>
+          <w:b/>
+        </w:rPr>
+        <w:t xml:space="preserve">)</w:t>
+      </w:r>
+      <w:r>
+        <w:t xml:space="preserve"> </w:t>
+      </w:r>
+      <w:r>
+        <w:rPr>
+          <w:rStyle w:val="VerbatimChar"/>
+        </w:rPr>
+        <w:t xml:space="preserve">markUnattemptedCancelled(companyId, companyName)</w:t>
+      </w:r>
+      <w:r>
+        <w:t xml:space="preserve"> </w:t>
+      </w:r>
+      <w:r>
+        <w:t xml:space="preserve">+ const</w:t>
+      </w:r>
+      <w:r>
+        <w:t xml:space="preserve"> </w:t>
+      </w:r>
+      <w:r>
+        <w:rPr>
+          <w:rStyle w:val="VerbatimChar"/>
+        </w:rPr>
+        <w:t xml:space="preserve">NOT_ATTEMPTED_CANCELLED_REASON = "not_attempted_cancelled"</w:t>
+      </w:r>
+      <w:r>
+        <w:t xml:space="preserve">: on a cancel break in the fetch loop, every still-</w:t>
+      </w:r>
+      <w:r>
+        <w:rPr>
+          <w:rStyle w:val="VerbatimChar"/>
+        </w:rPr>
+        <w:t xml:space="preserve">pending</w:t>
+      </w:r>
+      <w:r>
+        <w:t xml:space="preserve"> </w:t>
+      </w:r>
+      <w:r>
+        <w:t xml:space="preserve">accepted document is recorded fetch-dead with that reason, so cancellation no longer leaves URLs silently</w:t>
+      </w:r>
+      <w:r>
+        <w:t xml:space="preserve"> </w:t>
+      </w:r>
+      <w:r>
+        <w:rPr>
+          <w:rStyle w:val="VerbatimChar"/>
+        </w:rPr>
+        <w:t xml:space="preserve">pending</w:t>
+      </w:r>
+      <w:r>
+        <w:t xml:space="preserve">. Wired into the top-of-loop cancel break (non-fatal, wrapped in try/catch).</w:t>
       </w:r>
     </w:p>
     <w:p>
@@ -667,7 +804,7 @@
       <w:pPr>
         <w:numPr>
           <w:ilvl w:val="1"/>
-          <w:numId w:val="1002"/>
+          <w:numId w:val="1003"/>
         </w:numPr>
         <w:pStyle w:val="Compact"/>
       </w:pPr>
@@ -691,14 +828,26 @@
         <w:t xml:space="preserve"> </w:t>
       </w:r>
       <w:r>
-        <w:t xml:space="preserve">queued waiter is cancellable — on abort it withdraws from the local broker queue and consumes no slot (abort listener line 641); grant/abort races hand the slot straight back.</w:t>
+        <w:t xml:space="preserve">queued waiter is cancellable — on abort it withdraws from the local broker queue and consumes no slot; grant/abort races hand the slot straight back. In the isolated-child path it withdraws across IPC via</w:t>
+      </w:r>
+      <w:r>
+        <w:t xml:space="preserve"> </w:t>
+      </w:r>
+      <w:r>
+        <w:rPr>
+          <w:rStyle w:val="VerbatimChar"/>
+        </w:rPr>
+        <w:t xml:space="preserve">remoteAcquire("proc", signal, () =&gt; new OperationAbortedError(…, "proc_admission"))</w:t>
+      </w:r>
+      <w:r>
+        <w:t xml:space="preserve">.</w:t>
       </w:r>
     </w:p>
     <w:p>
       <w:pPr>
         <w:numPr>
           <w:ilvl w:val="1"/>
-          <w:numId w:val="1002"/>
+          <w:numId w:val="1003"/>
         </w:numPr>
         <w:pStyle w:val="Compact"/>
       </w:pPr>
@@ -722,14 +871,14 @@
         <w:t xml:space="preserve"> </w:t>
       </w:r>
       <w:r>
-        <w:t xml:space="preserve">registers an abort listener that SIGKILLs a hung extraction child at the abort instant (registration 747-750, kill 721-725).</w:t>
+        <w:t xml:space="preserve">registers an abort listener that SIGKILLs a hung extraction child at the abort instant.</w:t>
       </w:r>
     </w:p>
     <w:p>
       <w:pPr>
         <w:numPr>
           <w:ilvl w:val="1"/>
-          <w:numId w:val="1002"/>
+          <w:numId w:val="1003"/>
         </w:numPr>
         <w:pStyle w:val="Compact"/>
       </w:pPr>
@@ -799,14 +948,14 @@
         <w:t xml:space="preserve">runProcessCollect</w:t>
       </w:r>
       <w:r>
-        <w:t xml:space="preserve">), not in-process — a genuine execution boundary, not a 30 MB in-process size cap.</w:t>
+        <w:t xml:space="preserve">), not in-process — a genuine execution boundary.</w:t>
       </w:r>
     </w:p>
     <w:p>
       <w:pPr>
         <w:numPr>
           <w:ilvl w:val="1"/>
-          <w:numId w:val="1002"/>
+          <w:numId w:val="1003"/>
         </w:numPr>
         <w:pStyle w:val="Compact"/>
       </w:pPr>
@@ -843,45 +992,216 @@
         <w:t xml:space="preserve">only while the in-flight scope is live</w:t>
       </w:r>
       <w:r>
-        <w:t xml:space="preserve">; a caller arriving after that scope aborts starts its own attempt (liveness guard line 2519). The</w:t>
-      </w:r>
-      <w:r>
-        <w:t xml:space="preserve"> </w:t>
-      </w:r>
-      <w:r>
-        <w:rPr>
-          <w:rStyle w:val="VerbatimChar"/>
-        </w:rPr>
-        <w:t xml:space="preserve">b317833</w:t>
-      </w:r>
-      <w:r>
-        <w:t xml:space="preserve"> </w:t>
-      </w:r>
-      <w:r>
-        <w:t xml:space="preserve">commit adds a 20-line</w:t>
-      </w:r>
-      <w:r>
-        <w:t xml:space="preserve"> </w:t>
-      </w:r>
-      <w:r>
-        <w:rPr>
-          <w:rStyle w:val="VerbatimChar"/>
-        </w:rPr>
-        <w:t xml:space="preserve">__setProcessDocumentWorkerForTest</w:t>
-      </w:r>
-      <w:r>
-        <w:t xml:space="preserve"> </w:t>
-      </w:r>
-      <w:r>
-        <w:t xml:space="preserve">seam so this is testable without network.</w:t>
+        <w:t xml:space="preserve">; a caller arriving after that scope aborts starts its own attempt (liveness guard).</w:t>
+      </w:r>
+      <w:r>
+        <w:t xml:space="preserve"> </w:t>
+      </w:r>
+      <w:r>
+        <w:rPr>
+          <w:bCs/>
+          <w:b/>
+        </w:rPr>
+        <w:t xml:space="preserve">(</w:t>
+      </w:r>
+      <w:r>
+        <w:rPr>
+          <w:rStyle w:val="VerbatimChar"/>
+          <w:bCs/>
+          <w:b/>
+        </w:rPr>
+        <w:t xml:space="preserve">e4894ae</w:t>
+      </w:r>
+      <w:r>
+        <w:rPr>
+          <w:bCs/>
+          <w:b/>
+        </w:rPr>
+        <w:t xml:space="preserve">)</w:t>
+      </w:r>
+      <w:r>
+        <w:t xml:space="preserve"> </w:t>
+      </w:r>
+      <w:r>
+        <w:t xml:space="preserve">a caller that</w:t>
+      </w:r>
+      <w:r>
+        <w:t xml:space="preserve"> </w:t>
+      </w:r>
+      <w:r>
+        <w:rPr>
+          <w:iCs/>
+          <w:i/>
+        </w:rPr>
+        <w:t xml:space="preserve">coalesced onto</w:t>
+      </w:r>
+      <w:r>
+        <w:t xml:space="preserve"> </w:t>
+      </w:r>
+      <w:r>
+        <w:t xml:space="preserve">an in-flight op and whose</w:t>
+      </w:r>
+      <w:r>
+        <w:t xml:space="preserve"> </w:t>
+      </w:r>
+      <w:r>
+        <w:rPr>
+          <w:bCs/>
+          <w:b/>
+        </w:rPr>
+        <w:t xml:space="preserve">own</w:t>
+      </w:r>
+      <w:r>
+        <w:t xml:space="preserve"> </w:t>
+      </w:r>
+      <w:r>
+        <w:t xml:space="preserve">scope then aborts self-settles via</w:t>
+      </w:r>
+      <w:r>
+        <w:t xml:space="preserve"> </w:t>
+      </w:r>
+      <w:r>
+        <w:rPr>
+          <w:rStyle w:val="VerbatimChar"/>
+        </w:rPr>
+        <w:t xml:space="preserve">Promise.race([existing.promise, callerScope.whenAborted("coalesced_wait")])</w:t>
+      </w:r>
+      <w:r>
+        <w:t xml:space="preserve"> </w:t>
+      </w:r>
+      <w:r>
+        <w:t xml:space="preserve">instead of hanging on the obsolete shared op.</w:t>
       </w:r>
     </w:p>
     <w:p>
       <w:pPr>
+        <w:numPr>
+          <w:ilvl w:val="1"/>
+          <w:numId w:val="1003"/>
+        </w:numPr>
+        <w:pStyle w:val="Compact"/>
+      </w:pPr>
+      <w:r>
+        <w:rPr>
+          <w:bCs/>
+          <w:b/>
+        </w:rPr>
+        <w:t xml:space="preserve">(</w:t>
+      </w:r>
+      <w:r>
+        <w:rPr>
+          <w:rStyle w:val="VerbatimChar"/>
+          <w:bCs/>
+          <w:b/>
+        </w:rPr>
+        <w:t xml:space="preserve">782f99d</w:t>
+      </w:r>
+      <w:r>
+        <w:rPr>
+          <w:bCs/>
+          <w:b/>
+        </w:rPr>
+        <w:t xml:space="preserve">)</w:t>
+      </w:r>
+      <w:r>
+        <w:t xml:space="preserve"> </w:t>
+      </w:r>
+      <w:r>
+        <w:rPr>
+          <w:rStyle w:val="VerbatimChar"/>
+        </w:rPr>
+        <w:t xml:space="preserve">installBoundedPageInterrupt</w:t>
+      </w:r>
+      <w:r>
+        <w:t xml:space="preserve"> </w:t>
+      </w:r>
+      <w:r>
+        <w:t xml:space="preserve">+</w:t>
+      </w:r>
+      <w:r>
+        <w:t xml:space="preserve"> </w:t>
+      </w:r>
+      <w:r>
+        <w:rPr>
+          <w:rStyle w:val="VerbatimChar"/>
+        </w:rPr>
+        <w:t xml:space="preserve">BROWSER_ABORT_GRACE_MS</w:t>
+      </w:r>
+      <w:r>
+        <w:t xml:space="preserve"> </w:t>
+      </w:r>
+      <w:r>
+        <w:t xml:space="preserve">(500 ms): on scope abort, an in-flight browser op on the</w:t>
+      </w:r>
+      <w:r>
+        <w:t xml:space="preserve"> </w:t>
+      </w:r>
+      <w:r>
+        <w:rPr>
+          <w:rStyle w:val="VerbatimChar"/>
+          <w:bCs/>
+          <w:b/>
+        </w:rPr>
+        <w:t xml:space="preserve">fetchPdfViaBrowser</w:t>
+      </w:r>
+      <w:r>
+        <w:t xml:space="preserve"> </w:t>
+      </w:r>
+      <w:r>
+        <w:t xml:space="preserve">path is driven to settle within the grace bound + a gate round-trip instead of running to its own timeout.</w:t>
+      </w:r>
+      <w:r>
+        <w:t xml:space="preserve"> </w:t>
+      </w:r>
+      <w:r>
+        <w:rPr>
+          <w:bCs/>
+          <w:b/>
+        </w:rPr>
+        <w:t xml:space="preserve">Wired only on the PDF path; the</w:t>
+      </w:r>
+      <w:r>
+        <w:rPr>
+          <w:bCs/>
+          <w:b/>
+        </w:rPr>
+        <w:t xml:space="preserve"> </w:t>
+      </w:r>
+      <w:r>
+        <w:rPr>
+          <w:rStyle w:val="VerbatimChar"/>
+          <w:bCs/>
+          <w:b/>
+        </w:rPr>
+        <w:t xml:space="preserve">fetchWithBrowser</w:t>
+      </w:r>
+      <w:r>
+        <w:rPr>
+          <w:bCs/>
+          <w:b/>
+        </w:rPr>
+        <w:t xml:space="preserve"> </w:t>
+      </w:r>
+      <w:r>
+        <w:rPr>
+          <w:bCs/>
+          <w:b/>
+        </w:rPr>
+        <w:t xml:space="preserve">HTML path is not wired</w:t>
+      </w:r>
+      <w:r>
+        <w:t xml:space="preserve"> </w:t>
+      </w:r>
+      <w:r>
+        <w:t xml:space="preserve">(see §6.1).</w:t>
+      </w:r>
+    </w:p>
+    <w:p>
+      <w:pPr>
         <w:pStyle w:val="FirstParagraph"/>
       </w:pPr>
       <w:r>
-        <w:t xml:space="preserve">Tests added (all under</w:t>
+        <w:t xml:space="preserve">Tests added / present (all under</w:t>
       </w:r>
       <w:r>
         <w:t xml:space="preserve"> </w:t>
@@ -908,7 +1228,7 @@
         <w:t xml:space="preserve"> </w:t>
       </w:r>
       <w:r>
-        <w:t xml:space="preserve">(B1),</w:t>
+        <w:t xml:space="preserve">(B1, incl. B1-7 recovery window),</w:t>
       </w:r>
       <w:r>
         <w:t xml:space="preserve"> </w:t>
@@ -923,7 +1243,34 @@
         <w:t xml:space="preserve"> </w:t>
       </w:r>
       <w:r>
-        <w:t xml:space="preserve">(B2),</w:t>
+        <w:t xml:space="preserve">(B2 in-process),</w:t>
+      </w:r>
+      <w:r>
+        <w:t xml:space="preserve"> </w:t>
+      </w:r>
+      <w:r>
+        <w:rPr>
+          <w:rStyle w:val="VerbatimChar"/>
+        </w:rPr>
+        <w:t xml:space="preserve">isolated-proc-admission-boundary.test.ts</w:t>
+      </w:r>
+      <w:r>
+        <w:t xml:space="preserve"> </w:t>
+      </w:r>
+      <w:r>
+        <w:t xml:space="preserve">(B2 across real fork+IPC) + fixture</w:t>
+      </w:r>
+      <w:r>
+        <w:t xml:space="preserve"> </w:t>
+      </w:r>
+      <w:r>
+        <w:rPr>
+          <w:rStyle w:val="VerbatimChar"/>
+        </w:rPr>
+        <w:t xml:space="preserve">__fixtures__/proc-admission-child.ts</w:t>
+      </w:r>
+      <w:r>
+        <w:t xml:space="preserve">,</w:t>
       </w:r>
       <w:r>
         <w:t xml:space="preserve"> </w:t>
@@ -968,7 +1315,37 @@
         <w:t xml:space="preserve"> </w:t>
       </w:r>
       <w:r>
-        <w:t xml:space="preserve">(B7), plus</w:t>
+        <w:t xml:space="preserve">(B7, incl. B7-3 obsolete-work settlement),</w:t>
+      </w:r>
+      <w:r>
+        <w:t xml:space="preserve"> </w:t>
+      </w:r>
+      <w:r>
+        <w:rPr>
+          <w:rStyle w:val="VerbatimChar"/>
+        </w:rPr>
+        <w:t xml:space="preserve">browser-inflight-interrupt.test.ts</w:t>
+      </w:r>
+      <w:r>
+        <w:t xml:space="preserve"> </w:t>
+      </w:r>
+      <w:r>
+        <w:t xml:space="preserve">(bounded in-flight page interrupt, real Chromium),</w:t>
+      </w:r>
+      <w:r>
+        <w:t xml:space="preserve"> </w:t>
+      </w:r>
+      <w:r>
+        <w:rPr>
+          <w:rStyle w:val="VerbatimChar"/>
+        </w:rPr>
+        <w:t xml:space="preserve">unattempted-cancelled-boundary.test.ts</w:t>
+      </w:r>
+      <w:r>
+        <w:t xml:space="preserve"> </w:t>
+      </w:r>
+      <w:r>
+        <w:t xml:space="preserve">(explicit unattempted-URL outcomes, real Postgres),</w:t>
       </w:r>
       <w:r>
         <w:t xml:space="preserve"> </w:t>
@@ -1039,19 +1416,68 @@
         </w:r>
       </w:hyperlink>
       <w:r>
-        <w:t xml:space="preserve">. Headline: 7 test files, 27 subtests, all green on</w:t>
-      </w:r>
-      <w:r>
-        <w:t xml:space="preserve"> </w:t>
-      </w:r>
-      <w:r>
-        <w:rPr>
-          <w:rStyle w:val="VerbatimChar"/>
-        </w:rPr>
-        <w:t xml:space="preserve">b317833</w:t>
-      </w:r>
-      <w:r>
-        <w:t xml:space="preserve">; one case (B3) kills a real child process, four cases (browser close/reap) drive a real Chromium child, the rest exercise the real production broker/scope functions in-process.</w:t>
+        <w:t xml:space="preserve">. Headline:</w:t>
+      </w:r>
+      <w:r>
+        <w:t xml:space="preserve"> </w:t>
+      </w:r>
+      <w:r>
+        <w:rPr>
+          <w:bCs/>
+          <w:b/>
+        </w:rPr>
+        <w:t xml:space="preserve">11 test files, all green on</w:t>
+      </w:r>
+      <w:r>
+        <w:rPr>
+          <w:bCs/>
+          <w:b/>
+        </w:rPr>
+        <w:t xml:space="preserve"> </w:t>
+      </w:r>
+      <w:r>
+        <w:rPr>
+          <w:rStyle w:val="VerbatimChar"/>
+          <w:bCs/>
+          <w:b/>
+        </w:rPr>
+        <w:t xml:space="preserve">45cc661</w:t>
+      </w:r>
+      <w:r>
+        <w:t xml:space="preserve"> </w:t>
+      </w:r>
+      <w:r>
+        <w:t xml:space="preserve">— 33</w:t>
+      </w:r>
+      <w:r>
+        <w:t xml:space="preserve"> </w:t>
+      </w:r>
+      <w:r>
+        <w:rPr>
+          <w:rStyle w:val="VerbatimChar"/>
+        </w:rPr>
+        <w:t xml:space="preserve">node:test</w:t>
+      </w:r>
+      <w:r>
+        <w:t xml:space="preserve"> </w:t>
+      </w:r>
+      <w:r>
+        <w:t xml:space="preserve">subtests across 10 files +</w:t>
+      </w:r>
+      <w:r>
+        <w:t xml:space="preserve"> </w:t>
+      </w:r>
+      <w:r>
+        <w:rPr>
+          <w:rStyle w:val="VerbatimChar"/>
+        </w:rPr>
+        <w:t xml:space="preserve">scoring-cancellation.unit</w:t>
+      </w:r>
+      <w:r>
+        <w:t xml:space="preserve"> </w:t>
+      </w:r>
+      <w:r>
+        <w:t xml:space="preserve">(60 passed). Realism spans a real-killed child process (B3), a real fork+IPC admission withdrawal (B2b), a real Chromium child close/reap on four exit paths, a real Chromium page bounded-interrupt, real Postgres terminal-state assertions, and the real production broker/scope functions in-process for the rest.</w:t>
       </w:r>
     </w:p>
     <w:p>
@@ -1062,13 +1488,13 @@
       </w:r>
     </w:p>
     <w:bookmarkEnd w:id="22"/>
-    <w:bookmarkStart w:id="23" w:name="Xe3313e6e2f59ec94ec3c01ebc76e434a46d0290"/>
+    <w:bookmarkStart w:id="23" w:name="X675224e56f8a0a83aabf03dd8fcc07e89175c5b"/>
     <w:p>
       <w:pPr>
         <w:pStyle w:val="Heading2"/>
       </w:pPr>
       <w:r>
-        <w:t xml:space="preserve">3. Mutation-fail demo per gap (all run</w:t>
+        <w:t xml:space="preserve">3. Mutation-fail demo per guard (all run</w:t>
       </w:r>
       <w:r>
         <w:t xml:space="preserve"> </w:t>
@@ -1095,25 +1521,28 @@
         <w:rPr>
           <w:rStyle w:val="VerbatimChar"/>
         </w:rPr>
-        <w:t xml:space="preserve">git diff --quiet</w:t>
-      </w:r>
-      <w:r>
-        <w:t xml:space="preserve">, zero</w:t>
-      </w:r>
-      <w:r>
-        <w:t xml:space="preserve"> </w:t>
-      </w:r>
-      <w:r>
-        <w:rPr>
-          <w:rStyle w:val="VerbatimChar"/>
-        </w:rPr>
-        <w:t xml:space="preserve">B?-MUT</w:t>
-      </w:r>
-      <w:r>
-        <w:t xml:space="preserve"> </w:t>
-      </w:r>
-      <w:r>
-        <w:t xml:space="preserve">markers).</w:t>
+        <w:t xml:space="preserve">grep -rn MUTATION_MARKER server/</w:t>
+      </w:r>
+      <w:r>
+        <w:t xml:space="preserve"> </w:t>
+      </w:r>
+      <w:r>
+        <w:t xml:space="preserve">→ none;</w:t>
+      </w:r>
+      <w:r>
+        <w:t xml:space="preserve"> </w:t>
+      </w:r>
+      <w:r>
+        <w:rPr>
+          <w:rStyle w:val="VerbatimChar"/>
+        </w:rPr>
+        <w:t xml:space="preserve">git diff --quiet HEAD -- server/lib/processor.ts server/lib/pipeline.ts</w:t>
+      </w:r>
+      <w:r>
+        <w:t xml:space="preserve"> </w:t>
+      </w:r>
+      <w:r>
+        <w:t xml:space="preserve">→ clean).</w:t>
       </w:r>
     </w:p>
     <w:tbl>
@@ -1262,10 +1691,7 @@
               <w:rPr>
                 <w:rStyle w:val="VerbatimChar"/>
               </w:rPr>
-              <w:t xml:space="preserve">AssertionError … a scope was passed to the fetch boundary (was DEAD/omitted before B1)</w:t>
-            </w:r>
-            <w:r>
-              <w:t xml:space="preserve">; B1-2/B1-3 cascade</w:t>
+              <w:t xml:space="preserve">AssertionError … a scope was passed to the fetch boundary</w:t>
             </w:r>
           </w:p>
         </w:tc>
@@ -1283,40 +1709,58 @@
                 <w:bCs/>
                 <w:b/>
               </w:rPr>
-              <w:t xml:space="preserve">B2</w:t>
-            </w:r>
-            <w:r>
-              <w:t xml:space="preserve"> </w:t>
-            </w:r>
-            <w:r>
-              <w:t xml:space="preserve">queued-waiter abort</w:t>
-            </w:r>
-          </w:p>
-        </w:tc>
-        <w:tc>
-          <w:tcPr/>
-          <w:p>
-            <w:pPr>
-              <w:pStyle w:val="Compact"/>
-              <w:jc w:val="left"/>
-            </w:pPr>
-            <w:r>
-              <w:t xml:space="preserve">remove</w:t>
-            </w:r>
-            <w:r>
-              <w:t xml:space="preserve"> </w:t>
-            </w:r>
+              <w:t xml:space="preserve">B1-7</w:t>
+            </w:r>
+            <w:r>
+              <w:t xml:space="preserve"> </w:t>
+            </w:r>
+            <w:r>
+              <w:t xml:space="preserve">recovery window</w:t>
+            </w:r>
+          </w:p>
+        </w:tc>
+        <w:tc>
+          <w:tcPr/>
+          <w:p>
+            <w:pPr>
+              <w:pStyle w:val="Compact"/>
+              <w:jc w:val="left"/>
+            </w:pPr>
             <w:r>
               <w:rPr>
                 <w:rStyle w:val="VerbatimChar"/>
               </w:rPr>
-              <w:t xml:space="preserve">sig.addEventListener("abort", onAbort…)</w:t>
-            </w:r>
-            <w:r>
-              <w:t xml:space="preserve"> </w:t>
-            </w:r>
-            <w:r>
-              <w:t xml:space="preserve">(line 641)</w:t>
+              <w:t xml:space="preserve">remainingFetchBudgetMs</w:t>
+            </w:r>
+            <w:r>
+              <w:t xml:space="preserve"> </w:t>
+            </w:r>
+            <w:r>
+              <w:t xml:space="preserve">body →</w:t>
+            </w:r>
+            <w:r>
+              <w:t xml:space="preserve"> </w:t>
+            </w:r>
+            <w:r>
+              <w:rPr>
+                <w:rStyle w:val="VerbatimChar"/>
+              </w:rPr>
+              <w:t xml:space="preserve">return budgetMs;</w:t>
+            </w:r>
+            <w:r>
+              <w:t xml:space="preserve"> </w:t>
+            </w:r>
+            <w:r>
+              <w:t xml:space="preserve">(</w:t>
+            </w:r>
+            <w:r>
+              <w:rPr>
+                <w:rStyle w:val="VerbatimChar"/>
+              </w:rPr>
+              <w:t xml:space="preserve">MUTATION_MARKER_B2</w:t>
+            </w:r>
+            <w:r>
+              <w:t xml:space="preserve">)</w:t>
             </w:r>
           </w:p>
         </w:tc>
@@ -1332,7 +1776,7 @@
                 <w:bCs/>
                 <w:b/>
               </w:rPr>
-              <w:t xml:space="preserve">B2-1 fails</w:t>
+              <w:t xml:space="preserve">B1-7 fails</w:t>
             </w:r>
           </w:p>
         </w:tc>
@@ -1347,19 +1791,13 @@
               <w:rPr>
                 <w:rStyle w:val="VerbatimChar"/>
               </w:rPr>
-              <w:t xml:space="preserve">'hung' !== 'settled'</w:t>
-            </w:r>
-            <w:r>
-              <w:t xml:space="preserve">; B2-2/3/4 cascade</w:t>
-            </w:r>
-            <w:r>
-              <w:t xml:space="preserve"> </w:t>
-            </w:r>
-            <w:r>
-              <w:rPr>
-                <w:rStyle w:val="VerbatimChar"/>
-              </w:rPr>
-              <w:t xml:space="preserve">proc slot leaked (active=1)</w:t>
+              <w:t xml:space="preserve">6 pass / 1 fail</w:t>
+            </w:r>
+            <w:r>
+              <w:t xml:space="preserve"> </w:t>
+            </w:r>
+            <w:r>
+              <w:t xml:space="preserve">— window no longer shrinks with elapsed</w:t>
             </w:r>
           </w:p>
         </w:tc>
@@ -1377,25 +1815,34 @@
                 <w:bCs/>
                 <w:b/>
               </w:rPr>
-              <w:t xml:space="preserve">B3</w:t>
-            </w:r>
-            <w:r>
-              <w:t xml:space="preserve"> </w:t>
-            </w:r>
-            <w:r>
-              <w:t xml:space="preserve">stalled-child kill</w:t>
-            </w:r>
-          </w:p>
-        </w:tc>
-        <w:tc>
-          <w:tcPr/>
-          <w:p>
-            <w:pPr>
-              <w:pStyle w:val="Compact"/>
-              <w:jc w:val="left"/>
-            </w:pPr>
-            <w:r>
-              <w:t xml:space="preserve">disable abort registration (747-750)</w:t>
+              <w:t xml:space="preserve">B2</w:t>
+            </w:r>
+            <w:r>
+              <w:t xml:space="preserve"> </w:t>
+            </w:r>
+            <w:r>
+              <w:t xml:space="preserve">queued-waiter abort</w:t>
+            </w:r>
+          </w:p>
+        </w:tc>
+        <w:tc>
+          <w:tcPr/>
+          <w:p>
+            <w:pPr>
+              <w:pStyle w:val="Compact"/>
+              <w:jc w:val="left"/>
+            </w:pPr>
+            <w:r>
+              <w:t xml:space="preserve">remove</w:t>
+            </w:r>
+            <w:r>
+              <w:t xml:space="preserve"> </w:t>
+            </w:r>
+            <w:r>
+              <w:rPr>
+                <w:rStyle w:val="VerbatimChar"/>
+              </w:rPr>
+              <w:t xml:space="preserve">sig.addEventListener("abort", onAbort…)</w:t>
             </w:r>
           </w:p>
         </w:tc>
@@ -1411,7 +1858,7 @@
                 <w:bCs/>
                 <w:b/>
               </w:rPr>
-              <w:t xml:space="preserve">B3 fails</w:t>
+              <w:t xml:space="preserve">B2-1 fails</w:t>
             </w:r>
           </w:p>
         </w:tc>
@@ -1426,29 +1873,110 @@
               <w:rPr>
                 <w:rStyle w:val="VerbatimChar"/>
               </w:rPr>
-              <w:t xml:space="preserve">parent settled promptly after abort (elapsed=60005ms)</w:t>
-            </w:r>
-            <w:r>
-              <w:t xml:space="preserve"> </w:t>
-            </w:r>
-            <w:r>
-              <w:t xml:space="preserve">— child ran the</w:t>
-            </w:r>
-            <w:r>
-              <w:t xml:space="preserve"> </w:t>
-            </w:r>
+              <w:t xml:space="preserve">'hung' !== 'settled'</w:t>
+            </w:r>
+            <w:r>
+              <w:t xml:space="preserve">; B2-2/3/4 cascade</w:t>
+            </w:r>
+            <w:r>
+              <w:t xml:space="preserve"> </w:t>
+            </w:r>
+            <w:r>
+              <w:rPr>
+                <w:rStyle w:val="VerbatimChar"/>
+              </w:rPr>
+              <w:t xml:space="preserve">proc slot leaked</w:t>
+            </w:r>
+          </w:p>
+        </w:tc>
+      </w:tr>
+      <w:tr>
+        <w:tc>
+          <w:tcPr/>
+          <w:p>
+            <w:pPr>
+              <w:pStyle w:val="Compact"/>
+              <w:jc w:val="left"/>
+            </w:pPr>
             <w:r>
               <w:rPr>
                 <w:bCs/>
                 <w:b/>
               </w:rPr>
-              <w:t xml:space="preserve">full 60 s</w:t>
-            </w:r>
-            <w:r>
-              <w:t xml:space="preserve"> </w:t>
-            </w:r>
-            <w:r>
-              <w:t xml:space="preserve">timeout</w:t>
+              <w:t xml:space="preserve">B2b</w:t>
+            </w:r>
+            <w:r>
+              <w:t xml:space="preserve"> </w:t>
+            </w:r>
+            <w:r>
+              <w:t xml:space="preserve">IPC withdrawal error type</w:t>
+            </w:r>
+          </w:p>
+        </w:tc>
+        <w:tc>
+          <w:tcPr/>
+          <w:p>
+            <w:pPr>
+              <w:pStyle w:val="Compact"/>
+              <w:jc w:val="left"/>
+            </w:pPr>
+            <w:r>
+              <w:rPr>
+                <w:rStyle w:val="VerbatimChar"/>
+              </w:rPr>
+              <w:t xml:space="preserve">() =&gt; new OperationAbortedError(…, "proc_admission")</w:t>
+            </w:r>
+            <w:r>
+              <w:t xml:space="preserve"> </w:t>
+            </w:r>
+            <w:r>
+              <w:t xml:space="preserve">→</w:t>
+            </w:r>
+            <w:r>
+              <w:t xml:space="preserve"> </w:t>
+            </w:r>
+            <w:r>
+              <w:rPr>
+                <w:rStyle w:val="VerbatimChar"/>
+              </w:rPr>
+              <w:t xml:space="preserve">() =&gt; new Error("MUTATION_MARKER_B5 …")</w:t>
+            </w:r>
+          </w:p>
+        </w:tc>
+        <w:tc>
+          <w:tcPr/>
+          <w:p>
+            <w:pPr>
+              <w:pStyle w:val="Compact"/>
+              <w:jc w:val="left"/>
+            </w:pPr>
+            <w:r>
+              <w:rPr>
+                <w:bCs/>
+                <w:b/>
+              </w:rPr>
+              <w:t xml:space="preserve">isolated-proc-admission fails fast</w:t>
+            </w:r>
+          </w:p>
+        </w:tc>
+        <w:tc>
+          <w:tcPr/>
+          <w:p>
+            <w:pPr>
+              <w:pStyle w:val="Compact"/>
+              <w:jc w:val="left"/>
+            </w:pPr>
+            <w:r>
+              <w:t xml:space="preserve">child withdraws at ~700 ms but</w:t>
+            </w:r>
+            <w:r>
+              <w:t xml:space="preserve"> </w:t>
+            </w:r>
+            <w:r>
+              <w:rPr>
+                <w:rStyle w:val="VerbatimChar"/>
+              </w:rPr>
+              <w:t xml:space="preserve">isOperationAborted: false</w:t>
             </w:r>
           </w:p>
         </w:tc>
@@ -1466,28 +1994,25 @@
                 <w:bCs/>
                 <w:b/>
               </w:rPr>
-              <w:t xml:space="preserve">B7</w:t>
-            </w:r>
-            <w:r>
-              <w:t xml:space="preserve"> </w:t>
-            </w:r>
-            <w:r>
-              <w:t xml:space="preserve">coalescing</w:t>
-            </w:r>
-          </w:p>
-        </w:tc>
-        <w:tc>
-          <w:tcPr/>
-          <w:p>
-            <w:pPr>
-              <w:pStyle w:val="Compact"/>
-              <w:jc w:val="left"/>
-            </w:pPr>
-            <w:r>
-              <w:rPr>
-                <w:rStyle w:val="VerbatimChar"/>
-              </w:rPr>
-              <w:t xml:space="preserve">if (false &amp;&amp; existing …)</w:t>
+              <w:t xml:space="preserve">B3</w:t>
+            </w:r>
+            <w:r>
+              <w:t xml:space="preserve"> </w:t>
+            </w:r>
+            <w:r>
+              <w:t xml:space="preserve">stalled-child kill</w:t>
+            </w:r>
+          </w:p>
+        </w:tc>
+        <w:tc>
+          <w:tcPr/>
+          <w:p>
+            <w:pPr>
+              <w:pStyle w:val="Compact"/>
+              <w:jc w:val="left"/>
+            </w:pPr>
+            <w:r>
+              <w:t xml:space="preserve">disable abort registration</w:t>
             </w:r>
           </w:p>
         </w:tc>
@@ -1503,7 +2028,7 @@
                 <w:bCs/>
                 <w:b/>
               </w:rPr>
-              <w:t xml:space="preserve">B7-1 fails</w:t>
+              <w:t xml:space="preserve">B3 fails</w:t>
             </w:r>
           </w:p>
         </w:tc>
@@ -1518,13 +2043,23 @@
               <w:rPr>
                 <w:rStyle w:val="VerbatimChar"/>
               </w:rPr>
-              <w:t xml:space="preserve">2 !== 1</w:t>
-            </w:r>
-            <w:r>
-              <w:t xml:space="preserve"> </w:t>
-            </w:r>
-            <w:r>
-              <w:t xml:space="preserve">(two fetches)</w:t>
+              <w:t xml:space="preserve">parent settled promptly after abort (elapsed=60005ms)</w:t>
+            </w:r>
+            <w:r>
+              <w:t xml:space="preserve"> </w:t>
+            </w:r>
+            <w:r>
+              <w:t xml:space="preserve">— child ran the</w:t>
+            </w:r>
+            <w:r>
+              <w:t xml:space="preserve"> </w:t>
+            </w:r>
+            <w:r>
+              <w:rPr>
+                <w:bCs/>
+                <w:b/>
+              </w:rPr>
+              <w:t xml:space="preserve">full 60 s</w:t>
             </w:r>
           </w:p>
         </w:tc>
@@ -1548,7 +2083,7 @@
               <w:t xml:space="preserve"> </w:t>
             </w:r>
             <w:r>
-              <w:t xml:space="preserve">liveness</w:t>
+              <w:t xml:space="preserve">coalescing</w:t>
             </w:r>
           </w:p>
         </w:tc>
@@ -1563,25 +2098,7 @@
               <w:rPr>
                 <w:rStyle w:val="VerbatimChar"/>
               </w:rPr>
-              <w:t xml:space="preserve">if (existing) return …</w:t>
-            </w:r>
-            <w:r>
-              <w:t xml:space="preserve"> </w:t>
-            </w:r>
-            <w:r>
-              <w:t xml:space="preserve">(ignore</w:t>
-            </w:r>
-            <w:r>
-              <w:t xml:space="preserve"> </w:t>
-            </w:r>
-            <w:r>
-              <w:rPr>
-                <w:rStyle w:val="VerbatimChar"/>
-              </w:rPr>
-              <w:t xml:space="preserve">scope.aborted()</w:t>
-            </w:r>
-            <w:r>
-              <w:t xml:space="preserve">)</w:t>
+              <w:t xml:space="preserve">if (false &amp;&amp; existing …)</w:t>
             </w:r>
           </w:p>
         </w:tc>
@@ -1597,6 +2114,88 @@
                 <w:bCs/>
                 <w:b/>
               </w:rPr>
+              <w:t xml:space="preserve">B7-1 fails</w:t>
+            </w:r>
+          </w:p>
+        </w:tc>
+        <w:tc>
+          <w:tcPr/>
+          <w:p>
+            <w:pPr>
+              <w:pStyle w:val="Compact"/>
+              <w:jc w:val="left"/>
+            </w:pPr>
+            <w:r>
+              <w:rPr>
+                <w:rStyle w:val="VerbatimChar"/>
+              </w:rPr>
+              <w:t xml:space="preserve">2 !== 1</w:t>
+            </w:r>
+            <w:r>
+              <w:t xml:space="preserve"> </w:t>
+            </w:r>
+            <w:r>
+              <w:t xml:space="preserve">(two fetches)</w:t>
+            </w:r>
+          </w:p>
+        </w:tc>
+      </w:tr>
+      <w:tr>
+        <w:tc>
+          <w:tcPr/>
+          <w:p>
+            <w:pPr>
+              <w:pStyle w:val="Compact"/>
+              <w:jc w:val="left"/>
+            </w:pPr>
+            <w:r>
+              <w:rPr>
+                <w:bCs/>
+                <w:b/>
+              </w:rPr>
+              <w:t xml:space="preserve">B7</w:t>
+            </w:r>
+            <w:r>
+              <w:t xml:space="preserve"> </w:t>
+            </w:r>
+            <w:r>
+              <w:t xml:space="preserve">liveness</w:t>
+            </w:r>
+          </w:p>
+        </w:tc>
+        <w:tc>
+          <w:tcPr/>
+          <w:p>
+            <w:pPr>
+              <w:pStyle w:val="Compact"/>
+              <w:jc w:val="left"/>
+            </w:pPr>
+            <w:r>
+              <w:t xml:space="preserve">ignore</w:t>
+            </w:r>
+            <w:r>
+              <w:t xml:space="preserve"> </w:t>
+            </w:r>
+            <w:r>
+              <w:rPr>
+                <w:rStyle w:val="VerbatimChar"/>
+              </w:rPr>
+              <w:t xml:space="preserve">scope.aborted()</w:t>
+            </w:r>
+          </w:p>
+        </w:tc>
+        <w:tc>
+          <w:tcPr/>
+          <w:p>
+            <w:pPr>
+              <w:pStyle w:val="Compact"/>
+              <w:jc w:val="left"/>
+            </w:pPr>
+            <w:r>
+              <w:rPr>
+                <w:bCs/>
+                <w:b/>
+              </w:rPr>
               <w:t xml:space="preserve">B7-2 fails</w:t>
             </w:r>
           </w:p>
@@ -1619,6 +2218,331 @@
             </w:r>
             <w:r>
               <w:t xml:space="preserve">(new caller coalesced onto aborted entry)</w:t>
+            </w:r>
+          </w:p>
+        </w:tc>
+      </w:tr>
+      <w:tr>
+        <w:tc>
+          <w:tcPr/>
+          <w:p>
+            <w:pPr>
+              <w:pStyle w:val="Compact"/>
+              <w:jc w:val="left"/>
+            </w:pPr>
+            <w:r>
+              <w:rPr>
+                <w:bCs/>
+                <w:b/>
+              </w:rPr>
+              <w:t xml:space="preserve">B7-3</w:t>
+            </w:r>
+            <w:r>
+              <w:t xml:space="preserve"> </w:t>
+            </w:r>
+            <w:r>
+              <w:t xml:space="preserve">coalesced self-settle</w:t>
+            </w:r>
+          </w:p>
+        </w:tc>
+        <w:tc>
+          <w:tcPr/>
+          <w:p>
+            <w:pPr>
+              <w:pStyle w:val="Compact"/>
+              <w:jc w:val="left"/>
+            </w:pPr>
+            <w:r>
+              <w:rPr>
+                <w:rStyle w:val="VerbatimChar"/>
+              </w:rPr>
+              <w:t xml:space="preserve">Promise.race([existing.promise, callerScope.whenAborted(…)])</w:t>
+            </w:r>
+            <w:r>
+              <w:t xml:space="preserve"> </w:t>
+            </w:r>
+            <w:r>
+              <w:t xml:space="preserve">→</w:t>
+            </w:r>
+            <w:r>
+              <w:t xml:space="preserve"> </w:t>
+            </w:r>
+            <w:r>
+              <w:rPr>
+                <w:rStyle w:val="VerbatimChar"/>
+              </w:rPr>
+              <w:t xml:space="preserve">return existing.promise;</w:t>
+            </w:r>
+            <w:r>
+              <w:t xml:space="preserve"> </w:t>
+            </w:r>
+            <w:r>
+              <w:t xml:space="preserve">(</w:t>
+            </w:r>
+            <w:r>
+              <w:rPr>
+                <w:rStyle w:val="VerbatimChar"/>
+              </w:rPr>
+              <w:t xml:space="preserve">MUTATION_MARKER_B4</w:t>
+            </w:r>
+            <w:r>
+              <w:t xml:space="preserve">)</w:t>
+            </w:r>
+          </w:p>
+        </w:tc>
+        <w:tc>
+          <w:tcPr/>
+          <w:p>
+            <w:pPr>
+              <w:pStyle w:val="Compact"/>
+              <w:jc w:val="left"/>
+            </w:pPr>
+            <w:r>
+              <w:rPr>
+                <w:bCs/>
+                <w:b/>
+              </w:rPr>
+              <w:t xml:space="preserve">B7-3 fails</w:t>
+            </w:r>
+          </w:p>
+        </w:tc>
+        <w:tc>
+          <w:tcPr/>
+          <w:p>
+            <w:pPr>
+              <w:pStyle w:val="Compact"/>
+              <w:jc w:val="left"/>
+            </w:pPr>
+            <w:r>
+              <w:rPr>
+                <w:rStyle w:val="VerbatimChar"/>
+              </w:rPr>
+              <w:t xml:space="preserve">2 pass / 1 fail</w:t>
+            </w:r>
+            <w:r>
+              <w:t xml:space="preserve"> </w:t>
+            </w:r>
+            <w:r>
+              <w:t xml:space="preserve">— coalesced caller hangs past its own abort</w:t>
+            </w:r>
+          </w:p>
+        </w:tc>
+      </w:tr>
+      <w:tr>
+        <w:tc>
+          <w:tcPr/>
+          <w:p>
+            <w:pPr>
+              <w:pStyle w:val="Compact"/>
+              <w:jc w:val="left"/>
+            </w:pPr>
+            <w:r>
+              <w:rPr>
+                <w:bCs/>
+                <w:b/>
+              </w:rPr>
+              <w:t xml:space="preserve">B-browser</w:t>
+            </w:r>
+            <w:r>
+              <w:t xml:space="preserve"> </w:t>
+            </w:r>
+            <w:r>
+              <w:t xml:space="preserve">bounded interrupt</w:t>
+            </w:r>
+          </w:p>
+        </w:tc>
+        <w:tc>
+          <w:tcPr/>
+          <w:p>
+            <w:pPr>
+              <w:pStyle w:val="Compact"/>
+              <w:jc w:val="left"/>
+            </w:pPr>
+            <w:r>
+              <w:rPr>
+                <w:rStyle w:val="VerbatimChar"/>
+              </w:rPr>
+              <w:t xml:space="preserve">installBoundedPageInterrupt</w:t>
+            </w:r>
+            <w:r>
+              <w:t xml:space="preserve"> </w:t>
+            </w:r>
+            <w:r>
+              <w:rPr>
+                <w:rStyle w:val="VerbatimChar"/>
+              </w:rPr>
+              <w:t xml:space="preserve">onAbort</w:t>
+            </w:r>
+            <w:r>
+              <w:t xml:space="preserve"> </w:t>
+            </w:r>
+            <w:r>
+              <w:t xml:space="preserve">body → no-op (</w:t>
+            </w:r>
+            <w:r>
+              <w:rPr>
+                <w:rStyle w:val="VerbatimChar"/>
+              </w:rPr>
+              <w:t xml:space="preserve">MUTATION_MARKER_B3</w:t>
+            </w:r>
+            <w:r>
+              <w:t xml:space="preserve">)</w:t>
+            </w:r>
+          </w:p>
+        </w:tc>
+        <w:tc>
+          <w:tcPr/>
+          <w:p>
+            <w:pPr>
+              <w:pStyle w:val="Compact"/>
+              <w:jc w:val="left"/>
+            </w:pPr>
+            <w:r>
+              <w:rPr>
+                <w:bCs/>
+                <w:b/>
+              </w:rPr>
+              <w:t xml:space="preserve">browser-inflight-interrupt fails</w:t>
+            </w:r>
+          </w:p>
+        </w:tc>
+        <w:tc>
+          <w:tcPr/>
+          <w:p>
+            <w:pPr>
+              <w:pStyle w:val="Compact"/>
+              <w:jc w:val="left"/>
+            </w:pPr>
+            <w:r>
+              <w:t xml:space="preserve">page settled</w:t>
+            </w:r>
+            <w:r>
+              <w:t xml:space="preserve"> </w:t>
+            </w:r>
+            <w:r>
+              <w:rPr>
+                <w:bCs/>
+                <w:b/>
+              </w:rPr>
+              <w:t xml:space="preserve">8169 ms</w:t>
+            </w:r>
+            <w:r>
+              <w:t xml:space="preserve"> </w:t>
+            </w:r>
+            <w:r>
+              <w:t xml:space="preserve">vs</w:t>
+            </w:r>
+            <w:r>
+              <w:t xml:space="preserve"> </w:t>
+            </w:r>
+            <w:r>
+              <w:rPr>
+                <w:rStyle w:val="VerbatimChar"/>
+              </w:rPr>
+              <w:t xml:space="preserve">&lt; 3000 ms</w:t>
+            </w:r>
+            <w:r>
+              <w:t xml:space="preserve"> </w:t>
+            </w:r>
+            <w:r>
+              <w:t xml:space="preserve">bound</w:t>
+            </w:r>
+          </w:p>
+        </w:tc>
+      </w:tr>
+      <w:tr>
+        <w:tc>
+          <w:tcPr/>
+          <w:p>
+            <w:pPr>
+              <w:pStyle w:val="Compact"/>
+              <w:jc w:val="left"/>
+            </w:pPr>
+            <w:r>
+              <w:rPr>
+                <w:bCs/>
+                <w:b/>
+              </w:rPr>
+              <w:t xml:space="preserve">B6(unattempted)</w:t>
+            </w:r>
+            <w:r>
+              <w:t xml:space="preserve"> </w:t>
+            </w:r>
+            <w:r>
+              <w:t xml:space="preserve">terminal outcomes</w:t>
+            </w:r>
+          </w:p>
+        </w:tc>
+        <w:tc>
+          <w:tcPr/>
+          <w:p>
+            <w:pPr>
+              <w:pStyle w:val="Compact"/>
+              <w:jc w:val="left"/>
+            </w:pPr>
+            <w:r>
+              <w:t xml:space="preserve">pending filter</w:t>
+            </w:r>
+            <w:r>
+              <w:t xml:space="preserve"> </w:t>
+            </w:r>
+            <w:r>
+              <w:rPr>
+                <w:rStyle w:val="VerbatimChar"/>
+              </w:rPr>
+              <w:t xml:space="preserve">&amp;&amp; false</w:t>
+            </w:r>
+            <w:r>
+              <w:t xml:space="preserve"> </w:t>
+            </w:r>
+            <w:r>
+              <w:t xml:space="preserve">(</w:t>
+            </w:r>
+            <w:r>
+              <w:rPr>
+                <w:rStyle w:val="VerbatimChar"/>
+              </w:rPr>
+              <w:t xml:space="preserve">MUTATION_MARKER_B6</w:t>
+            </w:r>
+            <w:r>
+              <w:t xml:space="preserve">)</w:t>
+            </w:r>
+          </w:p>
+        </w:tc>
+        <w:tc>
+          <w:tcPr/>
+          <w:p>
+            <w:pPr>
+              <w:pStyle w:val="Compact"/>
+              <w:jc w:val="left"/>
+            </w:pPr>
+            <w:r>
+              <w:rPr>
+                <w:bCs/>
+                <w:b/>
+              </w:rPr>
+              <w:t xml:space="preserve">B6-1 fails</w:t>
+            </w:r>
+          </w:p>
+        </w:tc>
+        <w:tc>
+          <w:tcPr/>
+          <w:p>
+            <w:pPr>
+              <w:pStyle w:val="Compact"/>
+              <w:jc w:val="left"/>
+            </w:pPr>
+            <w:r>
+              <w:rPr>
+                <w:rStyle w:val="VerbatimChar"/>
+              </w:rPr>
+              <w:t xml:space="preserve">0 !== 3</w:t>
+            </w:r>
+            <w:r>
+              <w:t xml:space="preserve"> </w:t>
+            </w:r>
+            <w:r>
+              <w:t xml:space="preserve">— pending docs silently dropped again</w:t>
             </w:r>
           </w:p>
         </w:tc>
@@ -1629,31 +2553,51 @@
         <w:pStyle w:val="BodyText"/>
       </w:pPr>
       <w:r>
-        <w:t xml:space="preserve">B7 needs two mutants because the two clauses of the guard (</w:t>
-      </w:r>
-      <w:r>
-        <w:rPr>
-          <w:rStyle w:val="VerbatimChar"/>
-        </w:rPr>
-        <w:t xml:space="preserve">existing</w:t>
-      </w:r>
-      <w:r>
-        <w:t xml:space="preserve"> </w:t>
-      </w:r>
-      <w:r>
-        <w:t xml:space="preserve">and</w:t>
-      </w:r>
-      <w:r>
-        <w:t xml:space="preserve"> </w:t>
-      </w:r>
-      <w:r>
-        <w:rPr>
-          <w:rStyle w:val="VerbatimChar"/>
-        </w:rPr>
-        <w:t xml:space="preserve">!scope.aborted()</w:t>
-      </w:r>
-      <w:r>
-        <w:t xml:space="preserve">) are independently load-bearing.</w:t>
+        <w:t xml:space="preserve">B7 needs three mutants because the coalesce / liveness / self-settlement clauses are independently load-bearing. The B2b</w:t>
+      </w:r>
+      <w:r>
+        <w:t xml:space="preserve"> </w:t>
+      </w:r>
+      <w:r>
+        <w:rPr>
+          <w:iCs/>
+          <w:i/>
+        </w:rPr>
+        <w:t xml:space="preserve">error-type</w:t>
+      </w:r>
+      <w:r>
+        <w:t xml:space="preserve"> </w:t>
+      </w:r>
+      <w:r>
+        <w:t xml:space="preserve">mutation is the load-bearing one for the IPC path; a weaker</w:t>
+      </w:r>
+      <w:r>
+        <w:t xml:space="preserve"> </w:t>
+      </w:r>
+      <w:r>
+        <w:rPr>
+          <w:rStyle w:val="VerbatimChar"/>
+        </w:rPr>
+        <w:t xml:space="preserve">cancelAcquire</w:t>
+      </w:r>
+      <w:r>
+        <w:t xml:space="preserve">-suppression mutation did</w:t>
+      </w:r>
+      <w:r>
+        <w:t xml:space="preserve"> </w:t>
+      </w:r>
+      <w:r>
+        <w:rPr>
+          <w:bCs/>
+          <w:b/>
+        </w:rPr>
+        <w:t xml:space="preserve">not</w:t>
+      </w:r>
+      <w:r>
+        <w:t xml:space="preserve"> </w:t>
+      </w:r>
+      <w:r>
+        <w:t xml:space="preserve">fail (child-exit cleanup masks it) and that masking is documented in COVERAGE_MATRIX §2b rather than hidden.</w:t>
       </w:r>
     </w:p>
     <w:p>
@@ -1664,7 +2608,7 @@
       </w:r>
     </w:p>
     <w:bookmarkEnd w:id="23"/>
-    <w:bookmarkStart w:id="24" w:name="gate-results-b317833-this-session"/>
+    <w:bookmarkStart w:id="24" w:name="gate-results-45cc661-this-session"/>
     <w:p>
       <w:pPr>
         <w:pStyle w:val="Heading2"/>
@@ -1676,7 +2620,7 @@
         <w:rPr>
           <w:rStyle w:val="VerbatimChar"/>
         </w:rPr>
-        <w:t xml:space="preserve">b317833</w:t>
+        <w:t xml:space="preserve">45cc661</w:t>
       </w:r>
       <w:r>
         <w:t xml:space="preserve">, this session)</w:t>
@@ -1691,7 +2635,7 @@
           <w:bCs/>
           <w:b/>
         </w:rPr>
-        <w:t xml:space="preserve">All 7 cancellation test files green</w:t>
+        <w:t xml:space="preserve">All 11 cancellation test files green</w:t>
       </w:r>
       <w:r>
         <w:t xml:space="preserve"> </w:t>
@@ -1771,7 +2715,7 @@
         <w:rPr>
           <w:rStyle w:val="VerbatimChar"/>
         </w:rPr>
-        <w:t xml:space="preserve">company-pdf-recovery-boundary        pass 6  fail 0</w:t>
+        <w:t xml:space="preserve">company-pdf-recovery-boundary        pass 7  fail 0   (B1-7 added)</w:t>
       </w:r>
       <w:r>
         <w:br/>
@@ -1789,7 +2733,7 @@
         <w:rPr>
           <w:rStyle w:val="VerbatimChar"/>
         </w:rPr>
-        <w:t xml:space="preserve">inflight-coalescing-boundary         pass 2  fail 0</w:t>
+        <w:t xml:space="preserve">isolated-proc-admission-boundary     pass 1  fail 0   (real fork+IPC)</w:t>
       </w:r>
       <w:r>
         <w:br/>
@@ -1798,6 +2742,15 @@
         <w:rPr>
           <w:rStyle w:val="VerbatimChar"/>
         </w:rPr>
+        <w:t xml:space="preserve">inflight-coalescing-boundary         pass 3  fail 0   (B7-3 added)</w:t>
+      </w:r>
+      <w:r>
+        <w:br/>
+      </w:r>
+      <w:r>
+        <w:rPr>
+          <w:rStyle w:val="VerbatimChar"/>
+        </w:rPr>
         <w:t xml:space="preserve">stalled-extraction-boundary          pass 2  fail 0</w:t>
       </w:r>
       <w:r>
@@ -1817,6 +2770,33 @@
           <w:rStyle w:val="VerbatimChar"/>
         </w:rPr>
         <w:t xml:space="preserve">browser-close-order (real Chromium)  pass 4  fail 0</w:t>
+      </w:r>
+      <w:r>
+        <w:br/>
+      </w:r>
+      <w:r>
+        <w:rPr>
+          <w:rStyle w:val="VerbatimChar"/>
+        </w:rPr>
+        <w:t xml:space="preserve">browser-inflight-interrupt (real)    pass 1  fail 0</w:t>
+      </w:r>
+      <w:r>
+        <w:br/>
+      </w:r>
+      <w:r>
+        <w:rPr>
+          <w:rStyle w:val="VerbatimChar"/>
+        </w:rPr>
+        <w:t xml:space="preserve">unattempted-cancelled-boundary (PG)  pass 2  fail 0</w:t>
+      </w:r>
+      <w:r>
+        <w:br/>
+      </w:r>
+      <w:r>
+        <w:rPr>
+          <w:rStyle w:val="VerbatimChar"/>
+        </w:rPr>
+        <w:t xml:space="preserve">scoring-cancellation.unit            60 passed, 0 failed   (custom runner)</w:t>
       </w:r>
     </w:p>
     <w:p>
@@ -1824,7 +2804,35 @@
         <w:pStyle w:val="FirstParagraph"/>
       </w:pPr>
       <w:r>
-        <w:t xml:space="preserve">Total 27 subtests, 0 failures.</w:t>
+        <w:t xml:space="preserve">33</w:t>
+      </w:r>
+      <w:r>
+        <w:t xml:space="preserve"> </w:t>
+      </w:r>
+      <w:r>
+        <w:rPr>
+          <w:rStyle w:val="VerbatimChar"/>
+        </w:rPr>
+        <w:t xml:space="preserve">node:test</w:t>
+      </w:r>
+      <w:r>
+        <w:t xml:space="preserve"> </w:t>
+      </w:r>
+      <w:r>
+        <w:t xml:space="preserve">subtests + 60 scoring-unit assertions,</w:t>
+      </w:r>
+      <w:r>
+        <w:t xml:space="preserve"> </w:t>
+      </w:r>
+      <w:r>
+        <w:rPr>
+          <w:bCs/>
+          <w:b/>
+        </w:rPr>
+        <w:t xml:space="preserve">0 failures</w:t>
+      </w:r>
+      <w:r>
+        <w:t xml:space="preserve">.</w:t>
       </w:r>
       <w:r>
         <w:t xml:space="preserve"> </w:t>
@@ -1839,6 +2847,21 @@
         <w:t xml:space="preserve"> </w:t>
       </w:r>
       <w:r>
+        <w:t xml:space="preserve">and</w:t>
+      </w:r>
+      <w:r>
+        <w:t xml:space="preserve"> </w:t>
+      </w:r>
+      <w:r>
+        <w:rPr>
+          <w:rStyle w:val="VerbatimChar"/>
+        </w:rPr>
+        <w:t xml:space="preserve">browser-inflight-interrupt</w:t>
+      </w:r>
+      <w:r>
+        <w:t xml:space="preserve"> </w:t>
+      </w:r>
+      <w:r>
         <w:t xml:space="preserve">ran against a</w:t>
       </w:r>
       <w:r>
@@ -1861,10 +2884,41 @@
         <w:rPr>
           <w:rStyle w:val="VerbatimChar"/>
         </w:rPr>
-        <w:t xml:space="preserve">/usr/local/bin/chromium</w:t>
-      </w:r>
-      <w:r>
-        <w:t xml:space="preserve">), not skipped.</w:t>
+        <w:t xml:space="preserve">PUPPETEER_EXECUTABLE_PATH</w:t>
+      </w:r>
+      <w:r>
+        <w:t xml:space="preserve">), not skipped;</w:t>
+      </w:r>
+      <w:r>
+        <w:t xml:space="preserve"> </w:t>
+      </w:r>
+      <w:r>
+        <w:rPr>
+          <w:rStyle w:val="VerbatimChar"/>
+        </w:rPr>
+        <w:t xml:space="preserve">isolated-proc-admission-boundary</w:t>
+      </w:r>
+      <w:r>
+        <w:t xml:space="preserve"> </w:t>
+      </w:r>
+      <w:r>
+        <w:t xml:space="preserve">spawned a</w:t>
+      </w:r>
+      <w:r>
+        <w:t xml:space="preserve"> </w:t>
+      </w:r>
+      <w:r>
+        <w:rPr>
+          <w:bCs/>
+          <w:b/>
+        </w:rPr>
+        <w:t xml:space="preserve">real</w:t>
+      </w:r>
+      <w:r>
+        <w:t xml:space="preserve"> </w:t>
+      </w:r>
+      <w:r>
+        <w:t xml:space="preserve">OS child over the production IPC channel.</w:t>
       </w:r>
     </w:p>
     <w:p>
@@ -1892,10 +2946,10 @@
         <w:rPr>
           <w:rStyle w:val="VerbatimChar"/>
         </w:rPr>
-        <w:t xml:space="preserve">npx tsc --noEmit</w:t>
-      </w:r>
-      <w:r>
-        <w:t xml:space="preserve">, error sets sorted and path-normalized, candidate vs base (base run in a worktree checked out at</w:t>
+        <w:t xml:space="preserve">npx tsc --noEmit -p tsconfig.json</w:t>
+      </w:r>
+      <w:r>
+        <w:t xml:space="preserve">, error sets path/line-normalized and de-duplicated, candidate vs base (base run in a worktree checked out at</w:t>
       </w:r>
       <w:r>
         <w:t xml:space="preserve"> </w:t>
@@ -1910,6 +2964,21 @@
         <w:t xml:space="preserve"> </w:t>
       </w:r>
       <w:r>
+        <w:t xml:space="preserve">=</w:t>
+      </w:r>
+      <w:r>
+        <w:t xml:space="preserve"> </w:t>
+      </w:r>
+      <w:r>
+        <w:rPr>
+          <w:rStyle w:val="VerbatimChar"/>
+        </w:rPr>
+        <w:t xml:space="preserve">8c03b07</w:t>
+      </w:r>
+      <w:r>
+        <w:t xml:space="preserve"> </w:t>
+      </w:r>
+      <w:r>
         <w:t xml:space="preserve">with the same</w:t>
       </w:r>
       <w:r>
@@ -1922,7 +2991,35 @@
         <w:t xml:space="preserve">node_modules</w:t>
       </w:r>
       <w:r>
-        <w:t xml:space="preserve">):</w:t>
+        <w:t xml:space="preserve">). Normalization:</w:t>
+      </w:r>
+      <w:r>
+        <w:t xml:space="preserve"> </w:t>
+      </w:r>
+      <w:r>
+        <w:rPr>
+          <w:rStyle w:val="VerbatimChar"/>
+        </w:rPr>
+        <w:t xml:space="preserve">grep 'error TS' | sed -E 's/\(([0-9]+),([0-9]+)\)//' | sort -u</w:t>
+      </w:r>
+      <w:r>
+        <w:t xml:space="preserve"> </w:t>
+      </w:r>
+      <w:r>
+        <w:t xml:space="preserve">(unique error</w:t>
+      </w:r>
+      <w:r>
+        <w:t xml:space="preserve"> </w:t>
+      </w:r>
+      <w:r>
+        <w:rPr>
+          <w:iCs/>
+          <w:i/>
+        </w:rPr>
+        <w:t xml:space="preserve">signatures</w:t>
+      </w:r>
+      <w:r>
+        <w:t xml:space="preserve">, not raw line count).</w:t>
       </w:r>
     </w:p>
     <w:tbl>
@@ -1956,7 +3053,7 @@
               <w:jc w:val="left"/>
             </w:pPr>
             <w:r>
-              <w:t xml:space="preserve">errors</w:t>
+              <w:t xml:space="preserve">unique error signatures</w:t>
             </w:r>
           </w:p>
         </w:tc>
@@ -1991,7 +3088,7 @@
               <w:jc w:val="left"/>
             </w:pPr>
             <w:r>
-              <w:t xml:space="preserve">62</w:t>
+              <w:t xml:space="preserve">13</w:t>
             </w:r>
           </w:p>
         </w:tc>
@@ -2014,19 +3111,19 @@
               <w:rPr>
                 <w:rStyle w:val="VerbatimChar"/>
               </w:rPr>
-              <w:t xml:space="preserve">b317833</w:t>
-            </w:r>
-          </w:p>
-        </w:tc>
-        <w:tc>
-          <w:tcPr/>
-          <w:p>
-            <w:pPr>
-              <w:pStyle w:val="Compact"/>
-              <w:jc w:val="left"/>
-            </w:pPr>
-            <w:r>
-              <w:t xml:space="preserve">61</w:t>
+              <w:t xml:space="preserve">45cc661</w:t>
+            </w:r>
+          </w:p>
+        </w:tc>
+        <w:tc>
+          <w:tcPr/>
+          <w:p>
+            <w:pPr>
+              <w:pStyle w:val="Compact"/>
+              <w:jc w:val="left"/>
+            </w:pPr>
+            <w:r>
+              <w:t xml:space="preserve">12</w:t>
             </w:r>
           </w:p>
         </w:tc>
@@ -2119,7 +3216,7 @@
               <w:rPr>
                 <w:rStyle w:val="VerbatimChar"/>
               </w:rPr>
-              <w:t xml:space="preserve">processor.ts(4,22) TS7016: Could not find a declaration file for module 'pdf-parse'</w:t>
+              <w:t xml:space="preserve">server/lib/processor.ts … TS7016: Could not find a declaration file for module 'pdf-parse'</w:t>
             </w:r>
             <w:r>
               <w:t xml:space="preserve"> </w:t>
@@ -2161,22 +3258,85 @@
         <w:rPr>
           <w:rStyle w:val="VerbatimChar"/>
         </w:rPr>
+        <w:t xml:space="preserve">pdf-parse</w:t>
+      </w:r>
+      <w:r>
+        <w:t xml:space="preserve"> </w:t>
+      </w:r>
+      <w:r>
+        <w:t xml:space="preserve">declaration warning. All 12 remaining signatures are pre-existing vitest/</w:t>
+      </w:r>
+      <w:r>
+        <w:rPr>
+          <w:rStyle w:val="VerbatimChar"/>
+        </w:rPr>
         <w:t xml:space="preserve">any</w:t>
       </w:r>
       <w:r>
-        <w:t xml:space="preserve">-type warning. All 61 remaining errors are pre-existing vitest/</w:t>
-      </w:r>
-      <w:r>
-        <w:rPr>
-          <w:rStyle w:val="VerbatimChar"/>
-        </w:rPr>
-        <w:t xml:space="preserve">any</w:t>
-      </w:r>
-      <w:r>
-        <w:t xml:space="preserve"> </w:t>
-      </w:r>
-      <w:r>
-        <w:t xml:space="preserve">noise identical to base.</w:t>
+        <w:t xml:space="preserve"> </w:t>
+      </w:r>
+      <w:r>
+        <w:t xml:space="preserve">noise identical to base. (This counts unique error</w:t>
+      </w:r>
+      <w:r>
+        <w:t xml:space="preserve"> </w:t>
+      </w:r>
+      <w:r>
+        <w:rPr>
+          <w:iCs/>
+          <w:i/>
+        </w:rPr>
+        <w:t xml:space="preserve">signatures</w:t>
+      </w:r>
+      <w:r>
+        <w:t xml:space="preserve">; the earlier packet’s</w:t>
+      </w:r>
+      <w:r>
+        <w:t xml:space="preserve"> </w:t>
+      </w:r>
+      <w:r>
+        <w:t xml:space="preserve">“</w:t>
+      </w:r>
+      <w:r>
+        <w:t xml:space="preserve">62/61</w:t>
+      </w:r>
+      <w:r>
+        <w:t xml:space="preserve">”</w:t>
+      </w:r>
+      <w:r>
+        <w:t xml:space="preserve"> </w:t>
+      </w:r>
+      <w:r>
+        <w:t xml:space="preserve">figure counted raw error</w:t>
+      </w:r>
+      <w:r>
+        <w:t xml:space="preserve"> </w:t>
+      </w:r>
+      <w:r>
+        <w:rPr>
+          <w:iCs/>
+          <w:i/>
+        </w:rPr>
+        <w:t xml:space="preserve">lines</w:t>
+      </w:r>
+      <w:r>
+        <w:t xml:space="preserve"> </w:t>
+      </w:r>
+      <w:r>
+        <w:t xml:space="preserve">— the invariant is the same either way:</w:t>
+      </w:r>
+      <w:r>
+        <w:t xml:space="preserve"> </w:t>
+      </w:r>
+      <w:r>
+        <w:rPr>
+          <w:bCs/>
+          <w:b/>
+        </w:rPr>
+        <w:t xml:space="preserve">0 new errors</w:t>
+      </w:r>
+      <w:r>
+        <w:t xml:space="preserve">.)</w:t>
       </w:r>
     </w:p>
     <w:p>
@@ -2194,288 +3354,6 @@
       </w:pPr>
       <w:r>
         <w:t xml:space="preserve">6. Remaining unbounded / unproven paths (honest boundary)</w:t>
-      </w:r>
-    </w:p>
-    <w:p>
-      <w:pPr>
-        <w:numPr>
-          <w:ilvl w:val="0"/>
-          <w:numId w:val="1003"/>
-        </w:numPr>
-        <w:pStyle w:val="Compact"/>
-      </w:pPr>
-      <w:r>
-        <w:rPr>
-          <w:bCs/>
-          <w:b/>
-        </w:rPr>
-        <w:t xml:space="preserve">Active in-page CDP interruption is not instantaneous.</w:t>
-      </w:r>
-      <w:r>
-        <w:t xml:space="preserve"> </w:t>
-      </w:r>
-      <w:r>
-        <w:t xml:space="preserve">A fetch/navigation/</w:t>
-      </w:r>
-      <w:r>
-        <w:rPr>
-          <w:rStyle w:val="VerbatimChar"/>
-        </w:rPr>
-        <w:t xml:space="preserve">page.evaluate</w:t>
-      </w:r>
-      <w:r>
-        <w:t xml:space="preserve">/WAF challenge already executing inside Chromium when the scope aborts is</w:t>
-      </w:r>
-      <w:r>
-        <w:t xml:space="preserve"> </w:t>
-      </w:r>
-      <w:r>
-        <w:rPr>
-          <w:bCs/>
-          <w:b/>
-        </w:rPr>
-        <w:t xml:space="preserve">not</w:t>
-      </w:r>
-      <w:r>
-        <w:t xml:space="preserve"> </w:t>
-      </w:r>
-      <w:r>
-        <w:t xml:space="preserve">torn down mid-operation by the scope machinery. Cancellation is enforced at the next admission gate (B2/B7 refusal), by dispatch suppression (B1-3), and as the hard backstop by the job-isolation SIGKILL of the whole child (observed in</w:t>
-      </w:r>
-      <w:r>
-        <w:t xml:space="preserve"> </w:t>
-      </w:r>
-      <w:r>
-        <w:rPr>
-          <w:rStyle w:val="VerbatimChar"/>
-        </w:rPr>
-        <w:t xml:space="preserve">browser-close-order</w:t>
-      </w:r>
-      <w:r>
-        <w:t xml:space="preserve"> </w:t>
-      </w:r>
-      <w:r>
-        <w:t xml:space="preserve">child-death path). The in-flight operation can run to its own completion/timeout first —</w:t>
-      </w:r>
-      <w:r>
-        <w:t xml:space="preserve"> </w:t>
-      </w:r>
-      <w:r>
-        <w:rPr>
-          <w:rStyle w:val="VerbatimChar"/>
-        </w:rPr>
-        <w:t xml:space="preserve">browser-close-order</w:t>
-      </w:r>
-      <w:r>
-        <w:t xml:space="preserve">’s</w:t>
-      </w:r>
-      <w:r>
-        <w:t xml:space="preserve"> </w:t>
-      </w:r>
-      <w:r>
-        <w:rPr>
-          <w:rStyle w:val="VerbatimChar"/>
-        </w:rPr>
-        <w:t xml:space="preserve">A_inflight</w:t>
-      </w:r>
-      <w:r>
-        <w:t xml:space="preserve"> </w:t>
-      </w:r>
-      <w:r>
-        <w:t xml:space="preserve">case demonstrates exactly this by design.</w:t>
-      </w:r>
-    </w:p>
-    <w:p>
-      <w:pPr>
-        <w:numPr>
-          <w:ilvl w:val="0"/>
-          <w:numId w:val="1003"/>
-        </w:numPr>
-        <w:pStyle w:val="Compact"/>
-      </w:pPr>
-      <w:r>
-        <w:rPr>
-          <w:bCs/>
-          <w:b/>
-        </w:rPr>
-        <w:t xml:space="preserve">Deadline is bounded around the browser fetch, not threaded into it.</w:t>
-      </w:r>
-      <w:r>
-        <w:t xml:space="preserve"> </w:t>
-      </w:r>
-      <w:r>
-        <w:t xml:space="preserve">B1 proves the scope is passed and that dispatch stops after the deadline; it does not apply a per-request socket timeout equal to</w:t>
-      </w:r>
-      <w:r>
-        <w:t xml:space="preserve"> </w:t>
-      </w:r>
-      <w:r>
-        <w:rPr>
-          <w:rStyle w:val="VerbatimChar"/>
-        </w:rPr>
-        <w:t xml:space="preserve">remainingMs</w:t>
-      </w:r>
-      <w:r>
-        <w:t xml:space="preserve"> </w:t>
-      </w:r>
-      <w:r>
-        <w:t xml:space="preserve">inside</w:t>
-      </w:r>
-      <w:r>
-        <w:t xml:space="preserve"> </w:t>
-      </w:r>
-      <w:r>
-        <w:rPr>
-          <w:rStyle w:val="VerbatimChar"/>
-        </w:rPr>
-        <w:t xml:space="preserve">fetchIssuerPdfsWithPrimedSession</w:t>
-      </w:r>
-      <w:r>
-        <w:t xml:space="preserve">. The effective ceiling on an already-started browser fetch is the pipeline deadline → SIGKILL.</w:t>
-      </w:r>
-    </w:p>
-    <w:p>
-      <w:pPr>
-        <w:numPr>
-          <w:ilvl w:val="0"/>
-          <w:numId w:val="1003"/>
-        </w:numPr>
-        <w:pStyle w:val="Compact"/>
-      </w:pPr>
-      <w:r>
-        <w:rPr>
-          <w:bCs/>
-          <w:b/>
-        </w:rPr>
-        <w:t xml:space="preserve">Production recovery scope degenerates to the constant.</w:t>
-      </w:r>
-      <w:r>
-        <w:t xml:space="preserve"> </w:t>
-      </w:r>
-      <w:r>
-        <w:t xml:space="preserve">The production call omits</w:t>
-      </w:r>
-      <w:r>
-        <w:t xml:space="preserve"> </w:t>
-      </w:r>
-      <w:r>
-        <w:rPr>
-          <w:rStyle w:val="VerbatimChar"/>
-        </w:rPr>
-        <w:t xml:space="preserve">remainingMs</w:t>
-      </w:r>
-      <w:r>
-        <w:t xml:space="preserve">, so production recovery uses</w:t>
-      </w:r>
-      <w:r>
-        <w:t xml:space="preserve"> </w:t>
-      </w:r>
-      <w:r>
-        <w:rPr>
-          <w:rStyle w:val="VerbatimChar"/>
-        </w:rPr>
-        <w:t xml:space="preserve">PDF_RECOVERY_MAX_BUDGET_MS</w:t>
-      </w:r>
-      <w:r>
-        <w:t xml:space="preserve"> </w:t>
-      </w:r>
-      <w:r>
-        <w:t xml:space="preserve">(600000) as the scope deadline; the per-company remaining budget is enforced externally by job-isolation SIGKILL. The capping logic (B1-2) is asserted with a test-supplied</w:t>
-      </w:r>
-      <w:r>
-        <w:t xml:space="preserve"> </w:t>
-      </w:r>
-      <w:r>
-        <w:rPr>
-          <w:rStyle w:val="VerbatimChar"/>
-        </w:rPr>
-        <w:t xml:space="preserve">remainingMs</w:t>
-      </w:r>
-      <w:r>
-        <w:t xml:space="preserve"> </w:t>
-      </w:r>
-      <w:r>
-        <w:t xml:space="preserve">and is</w:t>
-      </w:r>
-      <w:r>
-        <w:t xml:space="preserve"> </w:t>
-      </w:r>
-      <w:r>
-        <w:rPr>
-          <w:bCs/>
-          <w:b/>
-        </w:rPr>
-        <w:t xml:space="preserve">not</w:t>
-      </w:r>
-      <w:r>
-        <w:t xml:space="preserve"> </w:t>
-      </w:r>
-      <w:r>
-        <w:t xml:space="preserve">the narrower cap running in production today.</w:t>
-      </w:r>
-    </w:p>
-    <w:p>
-      <w:pPr>
-        <w:numPr>
-          <w:ilvl w:val="0"/>
-          <w:numId w:val="1003"/>
-        </w:numPr>
-        <w:pStyle w:val="Compact"/>
-      </w:pPr>
-      <w:r>
-        <w:rPr>
-          <w:bCs/>
-          <w:b/>
-        </w:rPr>
-        <w:t xml:space="preserve">Specific production stalls unobserved.</w:t>
-      </w:r>
-      <w:r>
-        <w:t xml:space="preserve"> </w:t>
-      </w:r>
-      <w:r>
-        <w:t xml:space="preserve">The Idemitsu ~18-minute single step and the AXA analysis-prep ~7m26s stall (</w:t>
-      </w:r>
-      <w:r>
-        <w:rPr>
-          <w:rStyle w:val="VerbatimChar"/>
-        </w:rPr>
-        <w:t xml:space="preserve">TIMEOUT_INVESTIGATION.md</w:t>
-      </w:r>
-      <w:r>
-        <w:t xml:space="preserve">) are not reproduced here and are</w:t>
-      </w:r>
-      <w:r>
-        <w:t xml:space="preserve"> </w:t>
-      </w:r>
-      <w:r>
-        <w:rPr>
-          <w:bCs/>
-          <w:b/>
-        </w:rPr>
-        <w:t xml:space="preserve">not</w:t>
-      </w:r>
-      <w:r>
-        <w:t xml:space="preserve"> </w:t>
-      </w:r>
-      <w:r>
-        <w:t xml:space="preserve">claimed fixed by this patch.</w:t>
-      </w:r>
-    </w:p>
-    <w:p>
-      <w:r>
-        <w:pict>
-          <v:rect style="width:0;height:1.5pt" o:hralign="center" o:hrstd="t" o:hr="t"/>
-        </w:pict>
-      </w:r>
-    </w:p>
-    <w:bookmarkEnd w:id="26"/>
-    <w:bookmarkStart w:id="27" w:name="claims-kept-narrow"/>
-    <w:p>
-      <w:pPr>
-        <w:pStyle w:val="Heading2"/>
-      </w:pPr>
-      <w:r>
-        <w:t xml:space="preserve">7. Claims kept narrow</w:t>
       </w:r>
     </w:p>
     <w:p>
@@ -2491,64 +3369,109 @@
           <w:bCs/>
           <w:b/>
         </w:rPr>
-        <w:t xml:space="preserve">Candidate only.</w:t>
-      </w:r>
-      <w:r>
-        <w:t xml:space="preserve"> </w:t>
-      </w:r>
-      <w:r>
-        <w:rPr>
-          <w:rStyle w:val="VerbatimChar"/>
-        </w:rPr>
-        <w:t xml:space="preserve">b317833</w:t>
-      </w:r>
-      <w:r>
-        <w:t xml:space="preserve"> </w:t>
-      </w:r>
-      <w:r>
-        <w:t xml:space="preserve">is a review candidate on a feature branch. Nothing was merged, deployed, or run on Railway/paid providers.</w:t>
-      </w:r>
-      <w:r>
-        <w:t xml:space="preserve"> </w:t>
-      </w:r>
-      <w:r>
-        <w:rPr>
-          <w:rStyle w:val="VerbatimChar"/>
-        </w:rPr>
-        <w:t xml:space="preserve">origin/main</w:t>
-      </w:r>
-      <w:r>
-        <w:t xml:space="preserve"> </w:t>
-      </w:r>
-      <w:r>
-        <w:t xml:space="preserve">is untouched at</w:t>
-      </w:r>
-      <w:r>
-        <w:t xml:space="preserve"> </w:t>
-      </w:r>
-      <w:r>
-        <w:rPr>
-          <w:rStyle w:val="VerbatimChar"/>
-        </w:rPr>
-        <w:t xml:space="preserve">8c03b07</w:t>
-      </w:r>
-      <w:r>
-        <w:t xml:space="preserve"> </w:t>
-      </w:r>
-      <w:r>
-        <w:t xml:space="preserve">(verified by</w:t>
-      </w:r>
-      <w:r>
-        <w:t xml:space="preserve"> </w:t>
-      </w:r>
-      <w:r>
-        <w:rPr>
-          <w:rStyle w:val="VerbatimChar"/>
-        </w:rPr>
-        <w:t xml:space="preserve">git ls-remote</w:t>
-      </w:r>
-      <w:r>
-        <w:t xml:space="preserve">).</w:t>
+        <w:t xml:space="preserve">Active in-page CDP interruption is bounded on one path only.</w:t>
+      </w:r>
+      <w:r>
+        <w:t xml:space="preserve"> </w:t>
+      </w:r>
+      <w:r>
+        <w:rPr>
+          <w:rStyle w:val="VerbatimChar"/>
+        </w:rPr>
+        <w:t xml:space="preserve">installBoundedPageInterrupt</w:t>
+      </w:r>
+      <w:r>
+        <w:t xml:space="preserve"> </w:t>
+      </w:r>
+      <w:r>
+        <w:t xml:space="preserve">bounds an in-flight CDP op to</w:t>
+      </w:r>
+      <w:r>
+        <w:t xml:space="preserve"> </w:t>
+      </w:r>
+      <w:r>
+        <w:rPr>
+          <w:rStyle w:val="VerbatimChar"/>
+        </w:rPr>
+        <w:t xml:space="preserve">BROWSER_ABORT_GRACE_MS</w:t>
+      </w:r>
+      <w:r>
+        <w:t xml:space="preserve"> </w:t>
+      </w:r>
+      <w:r>
+        <w:t xml:space="preserve">+ a gate round-trip on the</w:t>
+      </w:r>
+      <w:r>
+        <w:t xml:space="preserve"> </w:t>
+      </w:r>
+      <w:r>
+        <w:rPr>
+          <w:rStyle w:val="VerbatimChar"/>
+          <w:bCs/>
+          <w:b/>
+        </w:rPr>
+        <w:t xml:space="preserve">fetchPdfViaBrowser</w:t>
+      </w:r>
+      <w:r>
+        <w:t xml:space="preserve"> </w:t>
+      </w:r>
+      <w:r>
+        <w:t xml:space="preserve">path (proven in</w:t>
+      </w:r>
+      <w:r>
+        <w:t xml:space="preserve"> </w:t>
+      </w:r>
+      <w:r>
+        <w:rPr>
+          <w:rStyle w:val="VerbatimChar"/>
+        </w:rPr>
+        <w:t xml:space="preserve">browser-inflight-interrupt.test.ts</w:t>
+      </w:r>
+      <w:r>
+        <w:t xml:space="preserve"> </w:t>
+      </w:r>
+      <w:r>
+        <w:t xml:space="preserve">with a real Chromium page, §5b of the matrix). The</w:t>
+      </w:r>
+      <w:r>
+        <w:t xml:space="preserve"> </w:t>
+      </w:r>
+      <w:r>
+        <w:rPr>
+          <w:rStyle w:val="VerbatimChar"/>
+          <w:bCs/>
+          <w:b/>
+        </w:rPr>
+        <w:t xml:space="preserve">fetchWithBrowser</w:t>
+      </w:r>
+      <w:r>
+        <w:rPr>
+          <w:bCs/>
+          <w:b/>
+        </w:rPr>
+        <w:t xml:space="preserve"> </w:t>
+      </w:r>
+      <w:r>
+        <w:rPr>
+          <w:bCs/>
+          <w:b/>
+        </w:rPr>
+        <w:t xml:space="preserve">HTML path is still not wired</w:t>
+      </w:r>
+      <w:r>
+        <w:t xml:space="preserve"> </w:t>
+      </w:r>
+      <w:r>
+        <w:t xml:space="preserve">to this helper — a fetch/navigation/</w:t>
+      </w:r>
+      <w:r>
+        <w:rPr>
+          <w:rStyle w:val="VerbatimChar"/>
+        </w:rPr>
+        <w:t xml:space="preserve">page.evaluate</w:t>
+      </w:r>
+      <w:r>
+        <w:t xml:space="preserve">/WAF challenge already executing on that path when the scope aborts is still not torn down mid-operation; it falls back to the next admission gate (B2/B7 refusal), dispatch suppression (B1-3), and ultimately the job-isolation SIGKILL (browser-close-order child-death path). This is a real, named remaining gap.</w:t>
       </w:r>
     </w:p>
     <w:p>
@@ -2564,13 +3487,40 @@
           <w:bCs/>
           <w:b/>
         </w:rPr>
-        <w:t xml:space="preserve">No full scoring fixture.</w:t>
-      </w:r>
-      <w:r>
-        <w:t xml:space="preserve"> </w:t>
-      </w:r>
-      <w:r>
-        <w:t xml:space="preserve">Per the reviewer’s clarification, no end-to-end scoring run is included; the behavioural tests drive the real caller-to-recovery boundary and the real admission/coalescing/subprocess functions directly.</w:t>
+        <w:t xml:space="preserve">Deadline is bounded around the browser fetch, not threaded into it.</w:t>
+      </w:r>
+      <w:r>
+        <w:t xml:space="preserve"> </w:t>
+      </w:r>
+      <w:r>
+        <w:t xml:space="preserve">B1 proves the scope is passed and that dispatch stops after the deadline; it does not apply a per-request socket timeout equal to</w:t>
+      </w:r>
+      <w:r>
+        <w:t xml:space="preserve"> </w:t>
+      </w:r>
+      <w:r>
+        <w:rPr>
+          <w:rStyle w:val="VerbatimChar"/>
+        </w:rPr>
+        <w:t xml:space="preserve">remainingMs</w:t>
+      </w:r>
+      <w:r>
+        <w:t xml:space="preserve"> </w:t>
+      </w:r>
+      <w:r>
+        <w:t xml:space="preserve">inside</w:t>
+      </w:r>
+      <w:r>
+        <w:t xml:space="preserve"> </w:t>
+      </w:r>
+      <w:r>
+        <w:rPr>
+          <w:rStyle w:val="VerbatimChar"/>
+        </w:rPr>
+        <w:t xml:space="preserve">fetchIssuerPdfsWithPrimedSession</w:t>
+      </w:r>
+      <w:r>
+        <w:t xml:space="preserve">. The effective ceiling on an already-started browser fetch on the un-wired path is the pipeline deadline → SIGKILL.</w:t>
       </w:r>
     </w:p>
     <w:p>
@@ -2586,29 +3536,102 @@
           <w:bCs/>
           <w:b/>
         </w:rPr>
-        <w:t xml:space="preserve">What is proven</w:t>
-      </w:r>
-      <w:r>
-        <w:t xml:space="preserve"> </w:t>
-      </w:r>
-      <w:r>
-        <w:t xml:space="preserve">is the requirement→assertion map in COVERAGE_MATRIX.md plus the §3 mutation demos.</w:t>
-      </w:r>
-      <w:r>
-        <w:t xml:space="preserve"> </w:t>
-      </w:r>
-      <w:r>
-        <w:rPr>
-          <w:bCs/>
-          <w:b/>
-        </w:rPr>
-        <w:t xml:space="preserve">What is not proven</w:t>
-      </w:r>
-      <w:r>
-        <w:t xml:space="preserve"> </w:t>
-      </w:r>
-      <w:r>
-        <w:t xml:space="preserve">is in §6 and in COVERAGE_MATRIX §6 — read the green suite as exactly that boundary, no wider.</w:t>
+        <w:t xml:space="preserve">(RESOLVED in this candidate)</w:t>
+      </w:r>
+      <w:r>
+        <w:t xml:space="preserve"> </w:t>
+      </w:r>
+      <w:r>
+        <w:t xml:space="preserve">The production recovery window previously degenerated to the</w:t>
+      </w:r>
+      <w:r>
+        <w:t xml:space="preserve"> </w:t>
+      </w:r>
+      <w:r>
+        <w:rPr>
+          <w:rStyle w:val="VerbatimChar"/>
+        </w:rPr>
+        <w:t xml:space="preserve">PDF_RECOVERY_MAX_BUDGET_MS</w:t>
+      </w:r>
+      <w:r>
+        <w:t xml:space="preserve"> </w:t>
+      </w:r>
+      <w:r>
+        <w:t xml:space="preserve">(600000) constant because the call site omitted</w:t>
+      </w:r>
+      <w:r>
+        <w:t xml:space="preserve"> </w:t>
+      </w:r>
+      <w:r>
+        <w:rPr>
+          <w:rStyle w:val="VerbatimChar"/>
+        </w:rPr>
+        <w:t xml:space="preserve">remainingMs</w:t>
+      </w:r>
+      <w:r>
+        <w:t xml:space="preserve">. It now feeds</w:t>
+      </w:r>
+      <w:r>
+        <w:t xml:space="preserve"> </w:t>
+      </w:r>
+      <w:r>
+        <w:rPr>
+          <w:rStyle w:val="VerbatimChar"/>
+        </w:rPr>
+        <w:t xml:space="preserve">remainingFetchBudgetMs(fetchPhaseStart)</w:t>
+      </w:r>
+      <w:r>
+        <w:t xml:space="preserve"> </w:t>
+      </w:r>
+      <w:r>
+        <w:t xml:space="preserve">— the configured budget minus elapsed, clamped to a floor — so the per-company remaining budget is honoured in production, not just in the test (B1-7 + mutation). The constant is unchanged; only the derivation changed.</w:t>
+      </w:r>
+    </w:p>
+    <w:p>
+      <w:pPr>
+        <w:numPr>
+          <w:ilvl w:val="0"/>
+          <w:numId w:val="1004"/>
+        </w:numPr>
+        <w:pStyle w:val="Compact"/>
+      </w:pPr>
+      <w:r>
+        <w:rPr>
+          <w:bCs/>
+          <w:b/>
+        </w:rPr>
+        <w:t xml:space="preserve">Specific production stalls unobserved.</w:t>
+      </w:r>
+      <w:r>
+        <w:t xml:space="preserve"> </w:t>
+      </w:r>
+      <w:r>
+        <w:t xml:space="preserve">The Idemitsu ~18-minute single step and the AXA analysis-prep ~7m26s stall (</w:t>
+      </w:r>
+      <w:r>
+        <w:rPr>
+          <w:rStyle w:val="VerbatimChar"/>
+        </w:rPr>
+        <w:t xml:space="preserve">TIMEOUT_INVESTIGATION.md</w:t>
+      </w:r>
+      <w:r>
+        <w:t xml:space="preserve">) are not reproduced here and are</w:t>
+      </w:r>
+      <w:r>
+        <w:t xml:space="preserve"> </w:t>
+      </w:r>
+      <w:r>
+        <w:rPr>
+          <w:bCs/>
+          <w:b/>
+        </w:rPr>
+        <w:t xml:space="preserve">not</w:t>
+      </w:r>
+      <w:r>
+        <w:t xml:space="preserve"> </w:t>
+      </w:r>
+      <w:r>
+        <w:t xml:space="preserve">claimed fixed by this patch.</w:t>
       </w:r>
     </w:p>
     <w:p>
@@ -2618,14 +3641,14 @@
         </w:pict>
       </w:r>
     </w:p>
-    <w:bookmarkEnd w:id="27"/>
-    <w:bookmarkStart w:id="28" w:name="reviewers-6-point-clarification-status"/>
+    <w:bookmarkEnd w:id="26"/>
+    <w:bookmarkStart w:id="27" w:name="claims-kept-narrow"/>
     <w:p>
       <w:pPr>
         <w:pStyle w:val="Heading2"/>
       </w:pPr>
       <w:r>
-        <w:t xml:space="preserve">8. Reviewer’s 6-point clarification — status</w:t>
+        <w:t xml:space="preserve">7. Claims kept narrow</w:t>
       </w:r>
     </w:p>
     <w:p>
@@ -2641,28 +3664,106 @@
           <w:bCs/>
           <w:b/>
         </w:rPr>
-        <w:t xml:space="preserve">Behavioural recovery boundary (not callee+grep).</w:t>
-      </w:r>
-      <w:r>
-        <w:t xml:space="preserve"> </w:t>
-      </w:r>
-      <w:r>
-        <w:t xml:space="preserve">Done —</w:t>
-      </w:r>
-      <w:r>
-        <w:t xml:space="preserve"> </w:t>
-      </w:r>
-      <w:r>
-        <w:rPr>
-          <w:rStyle w:val="VerbatimChar"/>
-        </w:rPr>
-        <w:t xml:space="preserve">runCompanyPdfRecovery</w:t>
-      </w:r>
-      <w:r>
-        <w:t xml:space="preserve"> </w:t>
-      </w:r>
-      <w:r>
-        <w:t xml:space="preserve">is real production code (pipeline.ts:275) called in the production pipeline (1714); B1-1..B1-6 assert scope construction, deadline capping, no-dispatch-after-expiry, retryable tail, healthy path, and expiry-through-the-real-admission-boundary. Mutation: scope-drop → B1-1 fail (§3).</w:t>
+        <w:t xml:space="preserve">Candidate only.</w:t>
+      </w:r>
+      <w:r>
+        <w:t xml:space="preserve"> </w:t>
+      </w:r>
+      <w:r>
+        <w:rPr>
+          <w:rStyle w:val="VerbatimChar"/>
+        </w:rPr>
+        <w:t xml:space="preserve">45cc661</w:t>
+      </w:r>
+      <w:r>
+        <w:t xml:space="preserve"> </w:t>
+      </w:r>
+      <w:r>
+        <w:t xml:space="preserve">is a review candidate on a feature branch. Nothing was merged, deployed, or run on Railway/paid providers.</w:t>
+      </w:r>
+      <w:r>
+        <w:t xml:space="preserve"> </w:t>
+      </w:r>
+      <w:r>
+        <w:rPr>
+          <w:rStyle w:val="VerbatimChar"/>
+        </w:rPr>
+        <w:t xml:space="preserve">origin/main</w:t>
+      </w:r>
+      <w:r>
+        <w:t xml:space="preserve"> </w:t>
+      </w:r>
+      <w:r>
+        <w:t xml:space="preserve">is untouched at</w:t>
+      </w:r>
+      <w:r>
+        <w:t xml:space="preserve"> </w:t>
+      </w:r>
+      <w:r>
+        <w:rPr>
+          <w:rStyle w:val="VerbatimChar"/>
+        </w:rPr>
+        <w:t xml:space="preserve">8c03b07</w:t>
+      </w:r>
+      <w:r>
+        <w:t xml:space="preserve"> </w:t>
+      </w:r>
+      <w:r>
+        <w:t xml:space="preserve">(verified:</w:t>
+      </w:r>
+      <w:r>
+        <w:t xml:space="preserve"> </w:t>
+      </w:r>
+      <w:r>
+        <w:rPr>
+          <w:rStyle w:val="VerbatimChar"/>
+        </w:rPr>
+        <w:t xml:space="preserve">git rev-parse origin/main</w:t>
+      </w:r>
+      <w:r>
+        <w:t xml:space="preserve"> </w:t>
+      </w:r>
+      <w:r>
+        <w:t xml:space="preserve">=</w:t>
+      </w:r>
+      <w:r>
+        <w:t xml:space="preserve"> </w:t>
+      </w:r>
+      <w:r>
+        <w:rPr>
+          <w:rStyle w:val="VerbatimChar"/>
+        </w:rPr>
+        <w:t xml:space="preserve">8c03b07…</w:t>
+      </w:r>
+      <w:r>
+        <w:t xml:space="preserve">; local</w:t>
+      </w:r>
+      <w:r>
+        <w:t xml:space="preserve"> </w:t>
+      </w:r>
+      <w:r>
+        <w:rPr>
+          <w:rStyle w:val="VerbatimChar"/>
+        </w:rPr>
+        <w:t xml:space="preserve">main</w:t>
+      </w:r>
+      <w:r>
+        <w:t xml:space="preserve"> </w:t>
+      </w:r>
+      <w:r>
+        <w:t xml:space="preserve">=</w:t>
+      </w:r>
+      <w:r>
+        <w:t xml:space="preserve"> </w:t>
+      </w:r>
+      <w:r>
+        <w:rPr>
+          <w:rStyle w:val="VerbatimChar"/>
+        </w:rPr>
+        <w:t xml:space="preserve">8c03b07…</w:t>
+      </w:r>
+      <w:r>
+        <w:t xml:space="preserve">).</w:t>
       </w:r>
     </w:p>
     <w:p>
@@ -2678,13 +3779,13 @@
           <w:bCs/>
           <w:b/>
         </w:rPr>
-        <w:t xml:space="preserve">Chromium realism + coverage matrix.</w:t>
-      </w:r>
-      <w:r>
-        <w:t xml:space="preserve"> </w:t>
-      </w:r>
-      <w:r>
-        <w:t xml:space="preserve">Done — COVERAGE_MATRIX.md states per case whether it is real-Chromium-child (R), real-subprocess (S), or broker/unit (U), and lists the active-interruption gap explicitly.</w:t>
+        <w:t xml:space="preserve">No full scoring fixture.</w:t>
+      </w:r>
+      <w:r>
+        <w:t xml:space="preserve"> </w:t>
+      </w:r>
+      <w:r>
+        <w:t xml:space="preserve">Per the reviewer’s clarification, no end-to-end scoring run is included; the behavioural tests drive the real caller-to-recovery boundary and the real admission/coalescing/subprocess/IPC/Postgres functions directly.</w:t>
       </w:r>
     </w:p>
     <w:p>
@@ -2700,55 +3801,43 @@
           <w:bCs/>
           <w:b/>
         </w:rPr>
-        <w:t xml:space="preserve">Fixture infra.</w:t>
-      </w:r>
-      <w:r>
-        <w:t xml:space="preserve"> </w:t>
-      </w:r>
-      <w:r>
-        <w:t xml:space="preserve">Done —</w:t>
-      </w:r>
-      <w:r>
-        <w:t xml:space="preserve"> </w:t>
-      </w:r>
-      <w:r>
-        <w:rPr>
-          <w:rStyle w:val="VerbatimChar"/>
-        </w:rPr>
-        <w:t xml:space="preserve">ciq-int-pg</w:t>
-      </w:r>
-      <w:r>
-        <w:t xml:space="preserve"> </w:t>
-      </w:r>
-      <w:r>
-        <w:t xml:space="preserve">(55432) /</w:t>
-      </w:r>
-      <w:r>
-        <w:t xml:space="preserve"> </w:t>
-      </w:r>
-      <w:r>
-        <w:rPr>
-          <w:rStyle w:val="VerbatimChar"/>
-        </w:rPr>
-        <w:t xml:space="preserve">ciq-int-redis</w:t>
-      </w:r>
-      <w:r>
-        <w:t xml:space="preserve"> </w:t>
-      </w:r>
-      <w:r>
-        <w:t xml:space="preserve">(56379), no production</w:t>
-      </w:r>
-      <w:r>
-        <w:t xml:space="preserve"> </w:t>
-      </w:r>
-      <w:r>
-        <w:rPr>
-          <w:rStyle w:val="VerbatimChar"/>
-        </w:rPr>
-        <w:t xml:space="preserve">DATABASE_URL</w:t>
-      </w:r>
-      <w:r>
-        <w:t xml:space="preserve">.</w:t>
+        <w:t xml:space="preserve">Mutations are session-local and reverted.</w:t>
+      </w:r>
+      <w:r>
+        <w:t xml:space="preserve"> </w:t>
+      </w:r>
+      <w:r>
+        <w:t xml:space="preserve">Every §3 mutation was applied, observed to fail the named assertion, and reverted in this session;</w:t>
+      </w:r>
+      <w:r>
+        <w:t xml:space="preserve"> </w:t>
+      </w:r>
+      <w:r>
+        <w:rPr>
+          <w:rStyle w:val="VerbatimChar"/>
+        </w:rPr>
+        <w:t xml:space="preserve">grep -rn MUTATION_MARKER server/</w:t>
+      </w:r>
+      <w:r>
+        <w:t xml:space="preserve"> </w:t>
+      </w:r>
+      <w:r>
+        <w:t xml:space="preserve">is empty and</w:t>
+      </w:r>
+      <w:r>
+        <w:t xml:space="preserve"> </w:t>
+      </w:r>
+      <w:r>
+        <w:rPr>
+          <w:rStyle w:val="VerbatimChar"/>
+        </w:rPr>
+        <w:t xml:space="preserve">git diff --quiet HEAD -- server/lib/processor.ts server/lib/pipeline.ts</w:t>
+      </w:r>
+      <w:r>
+        <w:t xml:space="preserve"> </w:t>
+      </w:r>
+      <w:r>
+        <w:t xml:space="preserve">is clean.</w:t>
       </w:r>
     </w:p>
     <w:p>
@@ -2764,35 +3853,53 @@
           <w:bCs/>
           <w:b/>
         </w:rPr>
-        <w:t xml:space="preserve">B6 killable execution boundary.</w:t>
-      </w:r>
-      <w:r>
-        <w:t xml:space="preserve"> </w:t>
-      </w:r>
-      <w:r>
-        <w:t xml:space="preserve">Done — subprocess, not in-process size cap (§1);</w:t>
-      </w:r>
-      <w:r>
-        <w:t xml:space="preserve"> </w:t>
-      </w:r>
-      <w:r>
-        <w:rPr>
-          <w:rStyle w:val="VerbatimChar"/>
-        </w:rPr>
-        <w:t xml:space="preserve">pdf-parse-subprocess-equivalence.test.ts</w:t>
-      </w:r>
-      <w:r>
-        <w:t xml:space="preserve"> </w:t>
-      </w:r>
-      <w:r>
-        <w:t xml:space="preserve">green.</w:t>
+        <w:t xml:space="preserve">What is proven</w:t>
+      </w:r>
+      <w:r>
+        <w:t xml:space="preserve"> </w:t>
+      </w:r>
+      <w:r>
+        <w:t xml:space="preserve">is the requirement→assertion map in COVERAGE_MATRIX.md plus the §3 mutation demos.</w:t>
+      </w:r>
+      <w:r>
+        <w:t xml:space="preserve"> </w:t>
+      </w:r>
+      <w:r>
+        <w:rPr>
+          <w:bCs/>
+          <w:b/>
+        </w:rPr>
+        <w:t xml:space="preserve">What is not proven</w:t>
+      </w:r>
+      <w:r>
+        <w:t xml:space="preserve"> </w:t>
+      </w:r>
+      <w:r>
+        <w:t xml:space="preserve">is in §6 and COVERAGE_MATRIX §6 — read the green suite as exactly that boundary, no wider.</w:t>
       </w:r>
     </w:p>
     <w:p>
+      <w:r>
+        <w:pict>
+          <v:rect style="width:0;height:1.5pt" o:hralign="center" o:hrstd="t" o:hr="t"/>
+        </w:pict>
+      </w:r>
+    </w:p>
+    <w:bookmarkEnd w:id="27"/>
+    <w:bookmarkStart w:id="28" w:name="reviewers-6-point-clarification-status"/>
+    <w:p>
+      <w:pPr>
+        <w:pStyle w:val="Heading2"/>
+      </w:pPr>
+      <w:r>
+        <w:t xml:space="preserve">8. Reviewer’s 6-point clarification — status</w:t>
+      </w:r>
+    </w:p>
+    <w:p>
       <w:pPr>
         <w:numPr>
           <w:ilvl w:val="0"/>
-          <w:numId w:val="1005"/>
+          <w:numId w:val="1006"/>
         </w:numPr>
         <w:pStyle w:val="Compact"/>
       </w:pPr>
@@ -2801,29 +3908,262 @@
           <w:bCs/>
           <w:b/>
         </w:rPr>
-        <w:t xml:space="preserve">Recovery budget value retained, semantics documented.</w:t>
-      </w:r>
-      <w:r>
-        <w:t xml:space="preserve"> </w:t>
-      </w:r>
-      <w:r>
-        <w:rPr>
-          <w:rStyle w:val="VerbatimChar"/>
-        </w:rPr>
-        <w:t xml:space="preserve">PDF_RECOVERY_MAX_BUDGET_MS=600000</w:t>
-      </w:r>
-      <w:r>
-        <w:t xml:space="preserve"> </w:t>
-      </w:r>
-      <w:r>
-        <w:t xml:space="preserve">retained; semantic change (company-wide absolute cap; production degeneration to the constant) documented in §6.3 and tested in B1-2/B1-4.</w:t>
+        <w:t xml:space="preserve">Behavioural recovery boundary (not callee+grep).</w:t>
+      </w:r>
+      <w:r>
+        <w:t xml:space="preserve"> </w:t>
+      </w:r>
+      <w:r>
+        <w:t xml:space="preserve">Done —</w:t>
+      </w:r>
+      <w:r>
+        <w:t xml:space="preserve"> </w:t>
+      </w:r>
+      <w:r>
+        <w:rPr>
+          <w:rStyle w:val="VerbatimChar"/>
+        </w:rPr>
+        <w:t xml:space="preserve">runCompanyPdfRecovery</w:t>
+      </w:r>
+      <w:r>
+        <w:t xml:space="preserve"> </w:t>
+      </w:r>
+      <w:r>
+        <w:t xml:space="preserve">is real production code called in the production pipeline; B1-1..B1-7 assert scope construction, deadline capping, no-dispatch-after-expiry, retryable tail, healthy path, expiry-through-the-real-admission-boundary,</w:t>
+      </w:r>
+      <w:r>
+        <w:t xml:space="preserve"> </w:t>
+      </w:r>
+      <w:r>
+        <w:rPr>
+          <w:bCs/>
+          <w:b/>
+        </w:rPr>
+        <w:t xml:space="preserve">and</w:t>
+      </w:r>
+      <w:r>
+        <w:t xml:space="preserve"> </w:t>
+      </w:r>
+      <w:r>
+        <w:t xml:space="preserve">that the production window is the real remaining budget (B1-7). Mutations: scope-drop → B1-1 fail;</w:t>
+      </w:r>
+      <w:r>
+        <w:t xml:space="preserve"> </w:t>
+      </w:r>
+      <w:r>
+        <w:rPr>
+          <w:rStyle w:val="VerbatimChar"/>
+        </w:rPr>
+        <w:t xml:space="preserve">return budgetMs</w:t>
+      </w:r>
+      <w:r>
+        <w:t xml:space="preserve"> </w:t>
+      </w:r>
+      <w:r>
+        <w:t xml:space="preserve">→ B1-7 fail (§3).</w:t>
       </w:r>
     </w:p>
     <w:p>
       <w:pPr>
         <w:numPr>
           <w:ilvl w:val="0"/>
-          <w:numId w:val="1005"/>
+          <w:numId w:val="1006"/>
+        </w:numPr>
+        <w:pStyle w:val="Compact"/>
+      </w:pPr>
+      <w:r>
+        <w:rPr>
+          <w:bCs/>
+          <w:b/>
+        </w:rPr>
+        <w:t xml:space="preserve">Chromium realism + coverage matrix.</w:t>
+      </w:r>
+      <w:r>
+        <w:t xml:space="preserve"> </w:t>
+      </w:r>
+      <w:r>
+        <w:t xml:space="preserve">Done — COVERAGE_MATRIX.md states per case whether it is real-Chromium-child (R), real-Chromium-page (R(page)), real-subprocess (S), real fork+IPC (I), real-Postgres (D), or broker/unit (U), and lists the active-interruption gap explicitly (including the still-un-wired</w:t>
+      </w:r>
+      <w:r>
+        <w:t xml:space="preserve"> </w:t>
+      </w:r>
+      <w:r>
+        <w:rPr>
+          <w:rStyle w:val="VerbatimChar"/>
+        </w:rPr>
+        <w:t xml:space="preserve">fetchWithBrowser</w:t>
+      </w:r>
+      <w:r>
+        <w:t xml:space="preserve"> </w:t>
+      </w:r>
+      <w:r>
+        <w:t xml:space="preserve">HTML path).</w:t>
+      </w:r>
+    </w:p>
+    <w:p>
+      <w:pPr>
+        <w:numPr>
+          <w:ilvl w:val="0"/>
+          <w:numId w:val="1006"/>
+        </w:numPr>
+        <w:pStyle w:val="Compact"/>
+      </w:pPr>
+      <w:r>
+        <w:rPr>
+          <w:bCs/>
+          <w:b/>
+        </w:rPr>
+        <w:t xml:space="preserve">Fixture infra.</w:t>
+      </w:r>
+      <w:r>
+        <w:t xml:space="preserve"> </w:t>
+      </w:r>
+      <w:r>
+        <w:t xml:space="preserve">Done —</w:t>
+      </w:r>
+      <w:r>
+        <w:t xml:space="preserve"> </w:t>
+      </w:r>
+      <w:r>
+        <w:rPr>
+          <w:rStyle w:val="VerbatimChar"/>
+        </w:rPr>
+        <w:t xml:space="preserve">ciq-int-pg</w:t>
+      </w:r>
+      <w:r>
+        <w:t xml:space="preserve"> </w:t>
+      </w:r>
+      <w:r>
+        <w:t xml:space="preserve">(55432) /</w:t>
+      </w:r>
+      <w:r>
+        <w:t xml:space="preserve"> </w:t>
+      </w:r>
+      <w:r>
+        <w:rPr>
+          <w:rStyle w:val="VerbatimChar"/>
+        </w:rPr>
+        <w:t xml:space="preserve">ciq-int-redis</w:t>
+      </w:r>
+      <w:r>
+        <w:t xml:space="preserve"> </w:t>
+      </w:r>
+      <w:r>
+        <w:t xml:space="preserve">(56379), no production</w:t>
+      </w:r>
+      <w:r>
+        <w:t xml:space="preserve"> </w:t>
+      </w:r>
+      <w:r>
+        <w:rPr>
+          <w:rStyle w:val="VerbatimChar"/>
+        </w:rPr>
+        <w:t xml:space="preserve">DATABASE_URL</w:t>
+      </w:r>
+      <w:r>
+        <w:t xml:space="preserve">.</w:t>
+      </w:r>
+    </w:p>
+    <w:p>
+      <w:pPr>
+        <w:numPr>
+          <w:ilvl w:val="0"/>
+          <w:numId w:val="1006"/>
+        </w:numPr>
+        <w:pStyle w:val="Compact"/>
+      </w:pPr>
+      <w:r>
+        <w:rPr>
+          <w:bCs/>
+          <w:b/>
+        </w:rPr>
+        <w:t xml:space="preserve">B6 killable execution boundary.</w:t>
+      </w:r>
+      <w:r>
+        <w:t xml:space="preserve"> </w:t>
+      </w:r>
+      <w:r>
+        <w:t xml:space="preserve">Done — subprocess, not in-process size cap (§1);</w:t>
+      </w:r>
+      <w:r>
+        <w:t xml:space="preserve"> </w:t>
+      </w:r>
+      <w:r>
+        <w:rPr>
+          <w:rStyle w:val="VerbatimChar"/>
+        </w:rPr>
+        <w:t xml:space="preserve">pdf-parse-subprocess-equivalence.test.ts</w:t>
+      </w:r>
+      <w:r>
+        <w:t xml:space="preserve"> </w:t>
+      </w:r>
+      <w:r>
+        <w:t xml:space="preserve">green. Admission withdrawal additionally proven across a real fork+IPC boundary (</w:t>
+      </w:r>
+      <w:r>
+        <w:rPr>
+          <w:rStyle w:val="VerbatimChar"/>
+        </w:rPr>
+        <w:t xml:space="preserve">isolated-proc-admission-boundary.test.ts</w:t>
+      </w:r>
+      <w:r>
+        <w:t xml:space="preserve">).</w:t>
+      </w:r>
+    </w:p>
+    <w:p>
+      <w:pPr>
+        <w:numPr>
+          <w:ilvl w:val="0"/>
+          <w:numId w:val="1006"/>
+        </w:numPr>
+        <w:pStyle w:val="Compact"/>
+      </w:pPr>
+      <w:r>
+        <w:rPr>
+          <w:bCs/>
+          <w:b/>
+        </w:rPr>
+        <w:t xml:space="preserve">Recovery budget value retained, semantics documented.</w:t>
+      </w:r>
+      <w:r>
+        <w:t xml:space="preserve"> </w:t>
+      </w:r>
+      <w:r>
+        <w:rPr>
+          <w:rStyle w:val="VerbatimChar"/>
+        </w:rPr>
+        <w:t xml:space="preserve">PDF_RECOVERY_MAX_BUDGET_MS=600000</w:t>
+      </w:r>
+      <w:r>
+        <w:t xml:space="preserve"> </w:t>
+      </w:r>
+      <w:r>
+        <w:t xml:space="preserve">retained; the production window now derives from the real remaining fetch-phase budget (B1-7), resolving the earlier</w:t>
+      </w:r>
+      <w:r>
+        <w:t xml:space="preserve"> </w:t>
+      </w:r>
+      <w:r>
+        <w:t xml:space="preserve">“</w:t>
+      </w:r>
+      <w:r>
+        <w:t xml:space="preserve">degenerates to the constant</w:t>
+      </w:r>
+      <w:r>
+        <w:t xml:space="preserve">”</w:t>
+      </w:r>
+      <w:r>
+        <w:t xml:space="preserve"> </w:t>
+      </w:r>
+      <w:r>
+        <w:t xml:space="preserve">gap. Documented in §6.3 and tested.</w:t>
+      </w:r>
+    </w:p>
+    <w:p>
+      <w:pPr>
+        <w:numPr>
+          <w:ilvl w:val="0"/>
+          <w:numId w:val="1006"/>
         </w:numPr>
         <w:pStyle w:val="Compact"/>
       </w:pPr>
@@ -3120,6 +4460,9 @@
     <w:abstractNumId w:val="991"/>
   </w:num>
   <w:num w:numId="1003">
+    <w:abstractNumId w:val="991"/>
+  </w:num>
+  <w:num w:numId="1004">
     <w:abstractNumId w:val="99411"/>
     <w:lvlOverride w:ilvl="0">
       <w:startOverride w:val="1"/>
@@ -3149,10 +4492,10 @@
       <w:startOverride w:val="1"/>
     </w:lvlOverride>
   </w:num>
-  <w:num w:numId="1004">
+  <w:num w:numId="1005">
     <w:abstractNumId w:val="991"/>
   </w:num>
-  <w:num w:numId="1005">
+  <w:num w:numId="1006">
     <w:abstractNumId w:val="99411"/>
     <w:lvlOverride w:ilvl="0">
       <w:startOverride w:val="1"/>

</xml_diff>